<commit_message>
Alterado relatorio final e a modelagem database
</commit_message>
<xml_diff>
--- a/Entrega Database.docx
+++ b/Entrega Database.docx
@@ -11,9 +11,9 @@
           <w:noProof/>
         </w:rPr>
         <w:drawing>
-          <wp:inline distT="0" distB="0" distL="0" distR="0" wp14:anchorId="25A57917" wp14:editId="1F7A867B">
-            <wp:extent cx="1632857" cy="472440"/>
-            <wp:effectExtent l="0" t="0" r="5715" b="3810"/>
+          <wp:inline distT="0" distB="0" distL="0" distR="0" wp14:anchorId="25A57917" wp14:editId="4137A0A4">
+            <wp:extent cx="777240" cy="224881"/>
+            <wp:effectExtent l="0" t="0" r="3810" b="3810"/>
             <wp:docPr id="762358199" name="Imagem 2"/>
             <wp:cNvGraphicFramePr>
               <a:graphicFrameLocks xmlns:a="http://schemas.openxmlformats.org/drawingml/2006/main" noChangeAspect="1"/>
@@ -28,7 +28,7 @@
                     </pic:cNvPicPr>
                   </pic:nvPicPr>
                   <pic:blipFill>
-                    <a:blip r:embed="rId5" cstate="print">
+                    <a:blip r:embed="rId8" cstate="print">
                       <a:extLst>
                         <a:ext uri="{28A0092B-C50C-407E-A947-70E740481C1C}">
                           <a14:useLocalDpi xmlns:a14="http://schemas.microsoft.com/office/drawing/2010/main" val="0"/>
@@ -43,7 +43,7 @@
                   <pic:spPr bwMode="auto">
                     <a:xfrm>
                       <a:off x="0" y="0"/>
-                      <a:ext cx="1668087" cy="482633"/>
+                      <a:ext cx="801353" cy="231858"/>
                     </a:xfrm>
                     <a:prstGeom prst="rect">
                       <a:avLst/>
@@ -90,11 +90,132 @@
       <w:pPr>
         <w:jc w:val="center"/>
       </w:pPr>
+      <w:r>
+        <w:rPr>
+          <w:noProof/>
+        </w:rPr>
+        <mc:AlternateContent>
+          <mc:Choice Requires="wps">
+            <w:drawing>
+              <wp:inline distT="0" distB="0" distL="0" distR="0" wp14:anchorId="4F65CD9B" wp14:editId="406CADEE">
+                <wp:extent cx="304800" cy="304800"/>
+                <wp:effectExtent l="0" t="0" r="0" b="0"/>
+                <wp:docPr id="773188229" name="Retângulo 1"/>
+                <wp:cNvGraphicFramePr>
+                  <a:graphicFrameLocks xmlns:a="http://schemas.openxmlformats.org/drawingml/2006/main" noChangeAspect="1"/>
+                </wp:cNvGraphicFramePr>
+                <a:graphic xmlns:a="http://schemas.openxmlformats.org/drawingml/2006/main">
+                  <a:graphicData uri="http://schemas.microsoft.com/office/word/2010/wordprocessingShape">
+                    <wps:wsp>
+                      <wps:cNvSpPr>
+                        <a:spLocks noChangeAspect="1" noChangeArrowheads="1"/>
+                      </wps:cNvSpPr>
+                      <wps:spPr bwMode="auto">
+                        <a:xfrm>
+                          <a:off x="0" y="0"/>
+                          <a:ext cx="304800" cy="304800"/>
+                        </a:xfrm>
+                        <a:prstGeom prst="rect">
+                          <a:avLst/>
+                        </a:prstGeom>
+                        <a:noFill/>
+                        <a:ln>
+                          <a:noFill/>
+                        </a:ln>
+                        <a:extLst>
+                          <a:ext uri="{909E8E84-426E-40DD-AFC4-6F175D3DCCD1}">
+                            <a14:hiddenFill xmlns:a14="http://schemas.microsoft.com/office/drawing/2010/main">
+                              <a:solidFill>
+                                <a:srgbClr val="FFFFFF"/>
+                              </a:solidFill>
+                            </a14:hiddenFill>
+                          </a:ext>
+                          <a:ext uri="{91240B29-F687-4F45-9708-019B960494DF}">
+                            <a14:hiddenLine xmlns:a14="http://schemas.microsoft.com/office/drawing/2010/main" w="9525">
+                              <a:solidFill>
+                                <a:srgbClr val="000000"/>
+                              </a:solidFill>
+                              <a:miter lim="800000"/>
+                              <a:headEnd/>
+                              <a:tailEnd/>
+                            </a14:hiddenLine>
+                          </a:ext>
+                        </a:extLst>
+                      </wps:spPr>
+                      <wps:bodyPr rot="0" vert="horz" wrap="square" lIns="91440" tIns="45720" rIns="91440" bIns="45720" anchor="t" anchorCtr="0" upright="1">
+                        <a:noAutofit/>
+                      </wps:bodyPr>
+                    </wps:wsp>
+                  </a:graphicData>
+                </a:graphic>
+              </wp:inline>
+            </w:drawing>
+          </mc:Choice>
+          <mc:Fallback>
+            <w:pict>
+              <v:rect w14:anchorId="41AF54E3" id="Retângulo 1" o:spid="_x0000_s1026" style="width:24pt;height:24pt;visibility:visible;mso-wrap-style:square;mso-left-percent:-10001;mso-top-percent:-10001;mso-position-horizontal:absolute;mso-position-horizontal-relative:char;mso-position-vertical:absolute;mso-position-vertical-relative:line;mso-left-percent:-10001;mso-top-percent:-10001;v-text-anchor:top" o:gfxdata="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" filled="f" stroked="f">
+                <o:lock v:ext="edit" aspectratio="t"/>
+                <w10:anchorlock/>
+              </v:rect>
+            </w:pict>
+          </mc:Fallback>
+        </mc:AlternateContent>
+      </w:r>
     </w:p>
     <w:p>
       <w:pPr>
         <w:jc w:val="center"/>
       </w:pPr>
+      <w:r>
+        <w:drawing>
+          <wp:inline distT="0" distB="0" distL="0" distR="0" wp14:anchorId="0C7498AF" wp14:editId="23063BFA">
+            <wp:extent cx="594360" cy="594360"/>
+            <wp:effectExtent l="0" t="0" r="0" b="0"/>
+            <wp:docPr id="1492329232" name="Imagem 3"/>
+            <wp:cNvGraphicFramePr>
+              <a:graphicFrameLocks xmlns:a="http://schemas.openxmlformats.org/drawingml/2006/main" noChangeAspect="1"/>
+            </wp:cNvGraphicFramePr>
+            <a:graphic xmlns:a="http://schemas.openxmlformats.org/drawingml/2006/main">
+              <a:graphicData uri="http://schemas.openxmlformats.org/drawingml/2006/picture">
+                <pic:pic xmlns:pic="http://schemas.openxmlformats.org/drawingml/2006/picture">
+                  <pic:nvPicPr>
+                    <pic:cNvPr id="0" name="Picture 8"/>
+                    <pic:cNvPicPr>
+                      <a:picLocks noChangeAspect="1" noChangeArrowheads="1"/>
+                    </pic:cNvPicPr>
+                  </pic:nvPicPr>
+                  <pic:blipFill>
+                    <a:blip r:embed="rId9" cstate="print">
+                      <a:extLst>
+                        <a:ext uri="{28A0092B-C50C-407E-A947-70E740481C1C}">
+                          <a14:useLocalDpi xmlns:a14="http://schemas.microsoft.com/office/drawing/2010/main" val="0"/>
+                        </a:ext>
+                      </a:extLst>
+                    </a:blip>
+                    <a:srcRect/>
+                    <a:stretch>
+                      <a:fillRect/>
+                    </a:stretch>
+                  </pic:blipFill>
+                  <pic:spPr bwMode="auto">
+                    <a:xfrm>
+                      <a:off x="0" y="0"/>
+                      <a:ext cx="594360" cy="594360"/>
+                    </a:xfrm>
+                    <a:prstGeom prst="rect">
+                      <a:avLst/>
+                    </a:prstGeom>
+                    <a:noFill/>
+                    <a:ln>
+                      <a:noFill/>
+                    </a:ln>
+                  </pic:spPr>
+                </pic:pic>
+              </a:graphicData>
+            </a:graphic>
+          </wp:inline>
+        </w:drawing>
+      </w:r>
     </w:p>
     <w:p>
       <w:pPr>
@@ -132,8 +253,6 @@
     <w:p/>
     <w:p/>
     <w:p/>
-    <w:p/>
-    <w:p/>
     <w:p>
       <w:pPr>
         <w:jc w:val="center"/>
@@ -147,8 +266,33 @@
           <w:sz w:val="32"/>
           <w:szCs w:val="32"/>
         </w:rPr>
-        <w:t>Avatar Inteligente e Interativo</w:t>
-      </w:r>
+        <w:t xml:space="preserve">Modelagem do </w:t>
+      </w:r>
+      <w:proofErr w:type="spellStart"/>
+      <w:r>
+        <w:rPr>
+          <w:sz w:val="32"/>
+          <w:szCs w:val="32"/>
+        </w:rPr>
+        <w:t>Database</w:t>
+      </w:r>
+      <w:proofErr w:type="spellEnd"/>
+      <w:r>
+        <w:rPr>
+          <w:sz w:val="32"/>
+          <w:szCs w:val="32"/>
+        </w:rPr>
+        <w:t xml:space="preserve"> para o Avatar Inteligente </w:t>
+      </w:r>
+      <w:proofErr w:type="spellStart"/>
+      <w:r>
+        <w:rPr>
+          <w:sz w:val="32"/>
+          <w:szCs w:val="32"/>
+        </w:rPr>
+        <w:t>SoulUp</w:t>
+      </w:r>
+      <w:proofErr w:type="spellEnd"/>
     </w:p>
     <w:p/>
     <w:p/>
@@ -161,6 +305,7 @@
     <w:p/>
     <w:p/>
     <w:p/>
+    <w:p/>
     <w:p>
       <w:pPr>
         <w:jc w:val="center"/>
@@ -168,6 +313,538 @@
       <w:r>
         <w:t>São Paulo 1º semestre de 2026</w:t>
       </w:r>
+    </w:p>
+    <w:sdt>
+      <w:sdtPr>
+        <w:rPr>
+          <w:rFonts w:asciiTheme="minorHAnsi" w:eastAsiaTheme="minorHAnsi" w:hAnsiTheme="minorHAnsi" w:cstheme="minorBidi"/>
+          <w:color w:val="auto"/>
+          <w:kern w:val="2"/>
+          <w:sz w:val="22"/>
+          <w:szCs w:val="22"/>
+          <w:lang w:eastAsia="en-US"/>
+          <w14:ligatures w14:val="standardContextual"/>
+        </w:rPr>
+        <w:id w:val="1156417213"/>
+        <w:docPartObj>
+          <w:docPartGallery w:val="Table of Contents"/>
+          <w:docPartUnique/>
+        </w:docPartObj>
+      </w:sdtPr>
+      <w:sdtEndPr>
+        <w:rPr>
+          <w:b/>
+          <w:bCs/>
+        </w:rPr>
+      </w:sdtEndPr>
+      <w:sdtContent>
+        <w:p>
+          <w:pPr>
+            <w:pStyle w:val="CabealhodoSumrio"/>
+            <w:rPr>
+              <w:rFonts w:ascii="Arial" w:hAnsi="Arial" w:cs="Arial"/>
+              <w:b/>
+              <w:bCs/>
+              <w:color w:val="auto"/>
+              <w:sz w:val="28"/>
+              <w:szCs w:val="28"/>
+            </w:rPr>
+          </w:pPr>
+          <w:r>
+            <w:rPr>
+              <w:rFonts w:ascii="Arial" w:hAnsi="Arial" w:cs="Arial"/>
+              <w:b/>
+              <w:bCs/>
+              <w:color w:val="auto"/>
+              <w:sz w:val="28"/>
+              <w:szCs w:val="28"/>
+            </w:rPr>
+            <w:t>SUMÁRIO</w:t>
+          </w:r>
+        </w:p>
+        <w:p>
+          <w:pPr>
+            <w:rPr>
+              <w:lang w:eastAsia="pt-BR"/>
+            </w:rPr>
+          </w:pPr>
+        </w:p>
+        <w:p>
+          <w:pPr>
+            <w:pStyle w:val="Sumrio1"/>
+            <w:tabs>
+              <w:tab w:val="right" w:leader="dot" w:pos="9061"/>
+            </w:tabs>
+            <w:spacing w:line="360" w:lineRule="auto"/>
+            <w:rPr>
+              <w:rFonts w:eastAsiaTheme="minorEastAsia"/>
+              <w:noProof/>
+              <w:sz w:val="24"/>
+              <w:szCs w:val="24"/>
+              <w:lang w:eastAsia="pt-BR"/>
+            </w:rPr>
+          </w:pPr>
+          <w:r>
+            <w:fldChar w:fldCharType="begin"/>
+          </w:r>
+          <w:r>
+            <w:instrText xml:space="preserve"> TOC \o "1-3" \h \z \u </w:instrText>
+          </w:r>
+          <w:r>
+            <w:fldChar w:fldCharType="separate"/>
+          </w:r>
+          <w:hyperlink w:anchor="_Toc230100942" w:history="1">
+            <w:r>
+              <w:rPr>
+                <w:rStyle w:val="Hyperlink"/>
+                <w:rFonts w:ascii="Arial" w:hAnsi="Arial" w:cs="Arial"/>
+                <w:noProof/>
+              </w:rPr>
+              <w:t>1. INTRODUÇÃO</w:t>
+            </w:r>
+            <w:r>
+              <w:rPr>
+                <w:noProof/>
+                <w:webHidden/>
+              </w:rPr>
+              <w:tab/>
+            </w:r>
+            <w:r>
+              <w:rPr>
+                <w:noProof/>
+                <w:webHidden/>
+              </w:rPr>
+              <w:fldChar w:fldCharType="begin"/>
+            </w:r>
+            <w:r>
+              <w:rPr>
+                <w:noProof/>
+                <w:webHidden/>
+              </w:rPr>
+              <w:instrText xml:space="preserve"> PAGEREF _Toc230100942 \h </w:instrText>
+            </w:r>
+            <w:r>
+              <w:rPr>
+                <w:noProof/>
+                <w:webHidden/>
+              </w:rPr>
+            </w:r>
+            <w:r>
+              <w:rPr>
+                <w:noProof/>
+                <w:webHidden/>
+              </w:rPr>
+              <w:fldChar w:fldCharType="separate"/>
+            </w:r>
+            <w:r>
+              <w:rPr>
+                <w:noProof/>
+                <w:webHidden/>
+              </w:rPr>
+              <w:t>3</w:t>
+            </w:r>
+            <w:r>
+              <w:rPr>
+                <w:noProof/>
+                <w:webHidden/>
+              </w:rPr>
+              <w:fldChar w:fldCharType="end"/>
+            </w:r>
+          </w:hyperlink>
+        </w:p>
+        <w:p>
+          <w:pPr>
+            <w:pStyle w:val="Sumrio1"/>
+            <w:tabs>
+              <w:tab w:val="right" w:leader="dot" w:pos="9061"/>
+            </w:tabs>
+            <w:spacing w:line="360" w:lineRule="auto"/>
+            <w:rPr>
+              <w:rFonts w:eastAsiaTheme="minorEastAsia"/>
+              <w:noProof/>
+              <w:sz w:val="24"/>
+              <w:szCs w:val="24"/>
+              <w:lang w:eastAsia="pt-BR"/>
+            </w:rPr>
+          </w:pPr>
+          <w:hyperlink w:anchor="_Toc230100943" w:history="1">
+            <w:r>
+              <w:rPr>
+                <w:rStyle w:val="Hyperlink"/>
+                <w:rFonts w:ascii="Arial" w:hAnsi="Arial" w:cs="Arial"/>
+                <w:noProof/>
+              </w:rPr>
+              <w:t>2. OBJETIVO</w:t>
+            </w:r>
+            <w:r>
+              <w:rPr>
+                <w:noProof/>
+                <w:webHidden/>
+              </w:rPr>
+              <w:tab/>
+            </w:r>
+            <w:r>
+              <w:rPr>
+                <w:noProof/>
+                <w:webHidden/>
+              </w:rPr>
+              <w:fldChar w:fldCharType="begin"/>
+            </w:r>
+            <w:r>
+              <w:rPr>
+                <w:noProof/>
+                <w:webHidden/>
+              </w:rPr>
+              <w:instrText xml:space="preserve"> PAGEREF _Toc230100943 \h </w:instrText>
+            </w:r>
+            <w:r>
+              <w:rPr>
+                <w:noProof/>
+                <w:webHidden/>
+              </w:rPr>
+            </w:r>
+            <w:r>
+              <w:rPr>
+                <w:noProof/>
+                <w:webHidden/>
+              </w:rPr>
+              <w:fldChar w:fldCharType="separate"/>
+            </w:r>
+            <w:r>
+              <w:rPr>
+                <w:noProof/>
+                <w:webHidden/>
+              </w:rPr>
+              <w:t>3</w:t>
+            </w:r>
+            <w:r>
+              <w:rPr>
+                <w:noProof/>
+                <w:webHidden/>
+              </w:rPr>
+              <w:fldChar w:fldCharType="end"/>
+            </w:r>
+          </w:hyperlink>
+        </w:p>
+        <w:p>
+          <w:pPr>
+            <w:pStyle w:val="Sumrio1"/>
+            <w:tabs>
+              <w:tab w:val="right" w:leader="dot" w:pos="9061"/>
+            </w:tabs>
+            <w:spacing w:line="360" w:lineRule="auto"/>
+            <w:rPr>
+              <w:rFonts w:eastAsiaTheme="minorEastAsia"/>
+              <w:noProof/>
+              <w:sz w:val="24"/>
+              <w:szCs w:val="24"/>
+              <w:lang w:eastAsia="pt-BR"/>
+            </w:rPr>
+          </w:pPr>
+          <w:hyperlink w:anchor="_Toc230100944" w:history="1">
+            <w:r>
+              <w:rPr>
+                <w:rStyle w:val="Hyperlink"/>
+                <w:rFonts w:ascii="Arial" w:hAnsi="Arial" w:cs="Arial"/>
+                <w:noProof/>
+              </w:rPr>
+              <w:t>3. PRINCIPAIS ENTIDADES DO SISTEMA</w:t>
+            </w:r>
+            <w:r>
+              <w:rPr>
+                <w:noProof/>
+                <w:webHidden/>
+              </w:rPr>
+              <w:tab/>
+            </w:r>
+            <w:r>
+              <w:rPr>
+                <w:noProof/>
+                <w:webHidden/>
+              </w:rPr>
+              <w:fldChar w:fldCharType="begin"/>
+            </w:r>
+            <w:r>
+              <w:rPr>
+                <w:noProof/>
+                <w:webHidden/>
+              </w:rPr>
+              <w:instrText xml:space="preserve"> PAGEREF _Toc230100944 \h </w:instrText>
+            </w:r>
+            <w:r>
+              <w:rPr>
+                <w:noProof/>
+                <w:webHidden/>
+              </w:rPr>
+            </w:r>
+            <w:r>
+              <w:rPr>
+                <w:noProof/>
+                <w:webHidden/>
+              </w:rPr>
+              <w:fldChar w:fldCharType="separate"/>
+            </w:r>
+            <w:r>
+              <w:rPr>
+                <w:noProof/>
+                <w:webHidden/>
+              </w:rPr>
+              <w:t>3</w:t>
+            </w:r>
+            <w:r>
+              <w:rPr>
+                <w:noProof/>
+                <w:webHidden/>
+              </w:rPr>
+              <w:fldChar w:fldCharType="end"/>
+            </w:r>
+          </w:hyperlink>
+        </w:p>
+        <w:p>
+          <w:pPr>
+            <w:pStyle w:val="Sumrio1"/>
+            <w:tabs>
+              <w:tab w:val="right" w:leader="dot" w:pos="9061"/>
+            </w:tabs>
+            <w:spacing w:line="360" w:lineRule="auto"/>
+            <w:rPr>
+              <w:rFonts w:eastAsiaTheme="minorEastAsia"/>
+              <w:noProof/>
+              <w:sz w:val="24"/>
+              <w:szCs w:val="24"/>
+              <w:lang w:eastAsia="pt-BR"/>
+            </w:rPr>
+          </w:pPr>
+          <w:hyperlink w:anchor="_Toc230100945" w:history="1">
+            <w:r>
+              <w:rPr>
+                <w:rStyle w:val="Hyperlink"/>
+                <w:rFonts w:ascii="Arial" w:hAnsi="Arial" w:cs="Arial"/>
+                <w:noProof/>
+              </w:rPr>
+              <w:t>4. REGRAS DE NEGÓCIO</w:t>
+            </w:r>
+            <w:r>
+              <w:rPr>
+                <w:noProof/>
+                <w:webHidden/>
+              </w:rPr>
+              <w:tab/>
+            </w:r>
+            <w:r>
+              <w:rPr>
+                <w:noProof/>
+                <w:webHidden/>
+              </w:rPr>
+              <w:fldChar w:fldCharType="begin"/>
+            </w:r>
+            <w:r>
+              <w:rPr>
+                <w:noProof/>
+                <w:webHidden/>
+              </w:rPr>
+              <w:instrText xml:space="preserve"> PAGEREF _Toc230100945 \h </w:instrText>
+            </w:r>
+            <w:r>
+              <w:rPr>
+                <w:noProof/>
+                <w:webHidden/>
+              </w:rPr>
+            </w:r>
+            <w:r>
+              <w:rPr>
+                <w:noProof/>
+                <w:webHidden/>
+              </w:rPr>
+              <w:fldChar w:fldCharType="separate"/>
+            </w:r>
+            <w:r>
+              <w:rPr>
+                <w:noProof/>
+                <w:webHidden/>
+              </w:rPr>
+              <w:t>4</w:t>
+            </w:r>
+            <w:r>
+              <w:rPr>
+                <w:noProof/>
+                <w:webHidden/>
+              </w:rPr>
+              <w:fldChar w:fldCharType="end"/>
+            </w:r>
+          </w:hyperlink>
+        </w:p>
+        <w:p>
+          <w:pPr>
+            <w:pStyle w:val="Sumrio1"/>
+            <w:tabs>
+              <w:tab w:val="right" w:leader="dot" w:pos="9061"/>
+            </w:tabs>
+            <w:spacing w:line="360" w:lineRule="auto"/>
+            <w:rPr>
+              <w:rFonts w:eastAsiaTheme="minorEastAsia"/>
+              <w:noProof/>
+              <w:sz w:val="24"/>
+              <w:szCs w:val="24"/>
+              <w:lang w:eastAsia="pt-BR"/>
+            </w:rPr>
+          </w:pPr>
+          <w:hyperlink w:anchor="_Toc230100946" w:history="1">
+            <w:r>
+              <w:rPr>
+                <w:rStyle w:val="Hyperlink"/>
+                <w:rFonts w:ascii="Arial" w:hAnsi="Arial" w:cs="Arial"/>
+                <w:noProof/>
+              </w:rPr>
+              <w:t>5. MODELO CONCEITUAL</w:t>
+            </w:r>
+            <w:r>
+              <w:rPr>
+                <w:noProof/>
+                <w:webHidden/>
+              </w:rPr>
+              <w:tab/>
+            </w:r>
+            <w:r>
+              <w:rPr>
+                <w:noProof/>
+                <w:webHidden/>
+              </w:rPr>
+              <w:fldChar w:fldCharType="begin"/>
+            </w:r>
+            <w:r>
+              <w:rPr>
+                <w:noProof/>
+                <w:webHidden/>
+              </w:rPr>
+              <w:instrText xml:space="preserve"> PAGEREF _Toc230100946 \h </w:instrText>
+            </w:r>
+            <w:r>
+              <w:rPr>
+                <w:noProof/>
+                <w:webHidden/>
+              </w:rPr>
+            </w:r>
+            <w:r>
+              <w:rPr>
+                <w:noProof/>
+                <w:webHidden/>
+              </w:rPr>
+              <w:fldChar w:fldCharType="separate"/>
+            </w:r>
+            <w:r>
+              <w:rPr>
+                <w:noProof/>
+                <w:webHidden/>
+              </w:rPr>
+              <w:t>5</w:t>
+            </w:r>
+            <w:r>
+              <w:rPr>
+                <w:noProof/>
+                <w:webHidden/>
+              </w:rPr>
+              <w:fldChar w:fldCharType="end"/>
+            </w:r>
+          </w:hyperlink>
+        </w:p>
+        <w:p>
+          <w:pPr>
+            <w:pStyle w:val="Sumrio1"/>
+            <w:tabs>
+              <w:tab w:val="right" w:leader="dot" w:pos="9061"/>
+            </w:tabs>
+            <w:rPr>
+              <w:rFonts w:eastAsiaTheme="minorEastAsia"/>
+              <w:noProof/>
+              <w:sz w:val="24"/>
+              <w:szCs w:val="24"/>
+              <w:lang w:eastAsia="pt-BR"/>
+            </w:rPr>
+          </w:pPr>
+          <w:hyperlink w:anchor="_Toc230100947" w:history="1">
+            <w:r>
+              <w:rPr>
+                <w:rStyle w:val="Hyperlink"/>
+                <w:rFonts w:ascii="Arial" w:hAnsi="Arial" w:cs="Arial"/>
+                <w:noProof/>
+              </w:rPr>
+              <w:t>6. MODELO RELACIONAL</w:t>
+            </w:r>
+            <w:r>
+              <w:rPr>
+                <w:noProof/>
+                <w:webHidden/>
+              </w:rPr>
+              <w:tab/>
+            </w:r>
+            <w:r>
+              <w:rPr>
+                <w:noProof/>
+                <w:webHidden/>
+              </w:rPr>
+              <w:fldChar w:fldCharType="begin"/>
+            </w:r>
+            <w:r>
+              <w:rPr>
+                <w:noProof/>
+                <w:webHidden/>
+              </w:rPr>
+              <w:instrText xml:space="preserve"> PAGEREF _Toc230100947 \h </w:instrText>
+            </w:r>
+            <w:r>
+              <w:rPr>
+                <w:noProof/>
+                <w:webHidden/>
+              </w:rPr>
+            </w:r>
+            <w:r>
+              <w:rPr>
+                <w:noProof/>
+                <w:webHidden/>
+              </w:rPr>
+              <w:fldChar w:fldCharType="separate"/>
+            </w:r>
+            <w:r>
+              <w:rPr>
+                <w:noProof/>
+                <w:webHidden/>
+              </w:rPr>
+              <w:t>6</w:t>
+            </w:r>
+            <w:r>
+              <w:rPr>
+                <w:noProof/>
+                <w:webHidden/>
+              </w:rPr>
+              <w:fldChar w:fldCharType="end"/>
+            </w:r>
+          </w:hyperlink>
+        </w:p>
+        <w:p>
+          <w:r>
+            <w:rPr>
+              <w:b/>
+              <w:bCs/>
+            </w:rPr>
+            <w:fldChar w:fldCharType="end"/>
+          </w:r>
+        </w:p>
+      </w:sdtContent>
+    </w:sdt>
+    <w:p>
+      <w:pPr>
+        <w:rPr>
+          <w:lang w:eastAsia="pt-BR"/>
+        </w:rPr>
+      </w:pPr>
+    </w:p>
+    <w:p>
+      <w:pPr>
+        <w:rPr>
+          <w:lang w:eastAsia="pt-BR"/>
+        </w:rPr>
+      </w:pPr>
     </w:p>
     <w:p/>
     <w:p/>
@@ -188,42 +865,43 @@
     <w:p/>
     <w:p/>
     <w:p/>
-    <w:p/>
-    <w:p/>
-    <w:p/>
-    <w:p/>
-    <w:p/>
-    <w:p/>
-    <w:p/>
-    <w:p/>
-    <w:p/>
-    <w:p/>
-    <w:p/>
-    <w:p/>
-    <w:p>
-      <w:pPr>
-        <w:pStyle w:val="PargrafodaLista"/>
-        <w:numPr>
-          <w:ilvl w:val="0"/>
-          <w:numId w:val="1"/>
-        </w:numPr>
-        <w:spacing w:after="0"/>
-        <w:ind w:left="357" w:hanging="357"/>
+    <w:p>
+      <w:pPr>
+        <w:pStyle w:val="Ttulo1"/>
         <w:rPr>
           <w:rFonts w:ascii="Arial" w:hAnsi="Arial" w:cs="Arial"/>
           <w:b/>
           <w:bCs/>
-        </w:rPr>
-      </w:pPr>
+          <w:color w:val="auto"/>
+          <w:sz w:val="24"/>
+          <w:szCs w:val="24"/>
+        </w:rPr>
+      </w:pPr>
+      <w:bookmarkStart w:id="0" w:name="_Toc230100942"/>
       <w:r>
         <w:rPr>
           <w:rFonts w:ascii="Arial" w:hAnsi="Arial" w:cs="Arial"/>
           <w:b/>
           <w:bCs/>
+          <w:color w:val="auto"/>
+          <w:sz w:val="24"/>
+          <w:szCs w:val="24"/>
         </w:rPr>
         <w:lastRenderedPageBreak/>
+        <w:t xml:space="preserve">1. </w:t>
+      </w:r>
+      <w:r>
+        <w:rPr>
+          <w:rFonts w:ascii="Arial" w:hAnsi="Arial" w:cs="Arial"/>
+          <w:b/>
+          <w:bCs/>
+          <w:color w:val="auto"/>
+          <w:sz w:val="24"/>
+          <w:szCs w:val="24"/>
+        </w:rPr>
         <w:t>INTRODUÇÃO</w:t>
       </w:r>
+      <w:bookmarkEnd w:id="0"/>
     </w:p>
     <w:p>
       <w:pPr>
@@ -239,7 +917,7 @@
     <w:p>
       <w:pPr>
         <w:spacing w:after="0" w:line="360" w:lineRule="auto"/>
-        <w:ind w:left="357"/>
+        <w:ind w:left="284"/>
         <w:jc w:val="both"/>
         <w:rPr>
           <w:rFonts w:ascii="Arial" w:hAnsi="Arial" w:cs="Arial"/>
@@ -270,6 +948,158 @@
           <w:rFonts w:ascii="Arial" w:hAnsi="Arial" w:cs="Arial"/>
         </w:rPr>
         <w:t>, surge a necessidade de guiar o usuário de forma personalizada.</w:t>
+      </w:r>
+    </w:p>
+    <w:p>
+      <w:pPr>
+        <w:spacing w:after="0" w:line="360" w:lineRule="auto"/>
+        <w:ind w:left="284"/>
+        <w:jc w:val="both"/>
+        <w:rPr>
+          <w:rFonts w:ascii="Arial" w:hAnsi="Arial" w:cs="Arial"/>
+        </w:rPr>
+      </w:pPr>
+      <w:r>
+        <w:rPr>
+          <w:rFonts w:ascii="Arial" w:hAnsi="Arial" w:cs="Arial"/>
+        </w:rPr>
+        <w:t>O crescimento da rede socia</w:t>
+      </w:r>
+      <w:r>
+        <w:rPr>
+          <w:rFonts w:ascii="Arial" w:hAnsi="Arial" w:cs="Arial"/>
+        </w:rPr>
+        <w:t>l</w:t>
+      </w:r>
+      <w:r>
+        <w:rPr>
+          <w:rFonts w:ascii="Arial" w:hAnsi="Arial" w:cs="Arial"/>
+        </w:rPr>
+        <w:t xml:space="preserve"> gerou um ambiente de alta dispersão, onde os usuários frequentemente se sentem sobrecarregados por excesso de informações ou desengajados por interações superficiais. </w:t>
+      </w:r>
+      <w:r>
+        <w:rPr>
+          <w:rFonts w:ascii="Arial" w:hAnsi="Arial" w:cs="Arial"/>
+        </w:rPr>
+        <w:t>E</w:t>
+      </w:r>
+      <w:r>
+        <w:rPr>
+          <w:rFonts w:ascii="Arial" w:hAnsi="Arial" w:cs="Arial"/>
+        </w:rPr>
+        <w:t>mbora a plataforma</w:t>
+      </w:r>
+      <w:r>
+        <w:rPr>
+          <w:rFonts w:ascii="Arial" w:hAnsi="Arial" w:cs="Arial"/>
+        </w:rPr>
+        <w:t xml:space="preserve"> </w:t>
+      </w:r>
+      <w:r>
+        <w:rPr>
+          <w:rFonts w:ascii="Arial" w:hAnsi="Arial" w:cs="Arial"/>
+        </w:rPr>
+        <w:t>conecte pessoas distantes, elas muitas vezes falham em criar espaços digitais dinâmicos e intuitivos para o gerenciamento de núcleos específicos, como grupos familiares.</w:t>
+      </w:r>
+    </w:p>
+    <w:p>
+      <w:pPr>
+        <w:spacing w:after="0" w:line="360" w:lineRule="auto"/>
+        <w:ind w:left="284"/>
+        <w:jc w:val="both"/>
+        <w:rPr>
+          <w:rFonts w:ascii="Arial" w:hAnsi="Arial" w:cs="Arial"/>
+        </w:rPr>
+      </w:pPr>
+      <w:r>
+        <w:rPr>
+          <w:rFonts w:ascii="Arial" w:hAnsi="Arial" w:cs="Arial"/>
+        </w:rPr>
+        <w:t>O desafio</w:t>
+      </w:r>
+      <w:r>
+        <w:rPr>
+          <w:rFonts w:ascii="Arial" w:hAnsi="Arial" w:cs="Arial"/>
+        </w:rPr>
+        <w:t xml:space="preserve"> então </w:t>
+      </w:r>
+      <w:r>
+        <w:rPr>
+          <w:rFonts w:ascii="Arial" w:hAnsi="Arial" w:cs="Arial"/>
+        </w:rPr>
+        <w:t xml:space="preserve">reside na falta de um guia ou assistente personalizado que consiga atuar em tempo real, interpretando o comportamento e as preferências do usuário para tornar a navegação útil e interativa, </w:t>
+      </w:r>
+      <w:r>
+        <w:rPr>
+          <w:rFonts w:ascii="Arial" w:hAnsi="Arial" w:cs="Arial"/>
+        </w:rPr>
+        <w:t xml:space="preserve">gerando recompensas, </w:t>
+      </w:r>
+      <w:r>
+        <w:rPr>
+          <w:rFonts w:ascii="Arial" w:hAnsi="Arial" w:cs="Arial"/>
+        </w:rPr>
+        <w:t xml:space="preserve">sem que isso resulte em </w:t>
+      </w:r>
+      <w:r>
+        <w:rPr>
+          <w:rFonts w:ascii="Arial" w:hAnsi="Arial" w:cs="Arial"/>
+        </w:rPr>
+        <w:t xml:space="preserve">altos </w:t>
+      </w:r>
+      <w:r>
+        <w:rPr>
+          <w:rFonts w:ascii="Arial" w:hAnsi="Arial" w:cs="Arial"/>
+        </w:rPr>
+        <w:t>custos de infraestrutura ou perda de performance da plataforma.</w:t>
+      </w:r>
+    </w:p>
+    <w:p>
+      <w:pPr>
+        <w:spacing w:after="0" w:line="360" w:lineRule="auto"/>
+        <w:ind w:left="284"/>
+        <w:jc w:val="both"/>
+        <w:rPr>
+          <w:rFonts w:ascii="Arial" w:hAnsi="Arial" w:cs="Arial"/>
+        </w:rPr>
+      </w:pPr>
+      <w:r>
+        <w:rPr>
+          <w:rFonts w:ascii="Arial" w:hAnsi="Arial" w:cs="Arial"/>
+        </w:rPr>
+        <w:t xml:space="preserve">A Eco Pulse apresenta o </w:t>
+      </w:r>
+      <w:proofErr w:type="spellStart"/>
+      <w:r>
+        <w:rPr>
+          <w:rFonts w:ascii="Arial" w:hAnsi="Arial" w:cs="Arial"/>
+        </w:rPr>
+        <w:t>Souly</w:t>
+      </w:r>
+      <w:proofErr w:type="spellEnd"/>
+      <w:r>
+        <w:rPr>
+          <w:rFonts w:ascii="Arial" w:hAnsi="Arial" w:cs="Arial"/>
+        </w:rPr>
+        <w:t xml:space="preserve"> um</w:t>
+      </w:r>
+      <w:r>
+        <w:rPr>
+          <w:rFonts w:ascii="Arial" w:hAnsi="Arial" w:cs="Arial"/>
+        </w:rPr>
+        <w:t xml:space="preserve"> avatar inteligente </w:t>
+      </w:r>
+      <w:r>
+        <w:rPr>
+          <w:rFonts w:ascii="Arial" w:hAnsi="Arial" w:cs="Arial"/>
+        </w:rPr>
+        <w:t xml:space="preserve">que </w:t>
+      </w:r>
+      <w:r>
+        <w:rPr>
+          <w:rFonts w:ascii="Arial" w:hAnsi="Arial" w:cs="Arial"/>
+        </w:rPr>
+        <w:t>atua como um assistente dentro da plataforma, tornando a experiência mais interativa e engajadora.</w:t>
       </w:r>
     </w:p>
     <w:p>
@@ -281,48 +1111,39 @@
           <w:rFonts w:ascii="Arial" w:hAnsi="Arial" w:cs="Arial"/>
         </w:rPr>
       </w:pPr>
-      <w:r>
-        <w:rPr>
-          <w:rFonts w:ascii="Arial" w:hAnsi="Arial" w:cs="Arial"/>
-        </w:rPr>
-        <w:t>O crescimento da rede socia</w:t>
-      </w:r>
-      <w:r>
-        <w:rPr>
-          <w:rFonts w:ascii="Arial" w:hAnsi="Arial" w:cs="Arial"/>
-        </w:rPr>
-        <w:t>l</w:t>
-      </w:r>
-      <w:r>
-        <w:rPr>
-          <w:rFonts w:ascii="Arial" w:hAnsi="Arial" w:cs="Arial"/>
-        </w:rPr>
-        <w:t xml:space="preserve"> gerou um ambiente de alta dispersão, onde os usuários frequentemente se sentem sobrecarregados por excesso de informações ou desengajados por interações superficiais. </w:t>
-      </w:r>
-      <w:r>
-        <w:rPr>
-          <w:rFonts w:ascii="Arial" w:hAnsi="Arial" w:cs="Arial"/>
-        </w:rPr>
-        <w:t>E</w:t>
-      </w:r>
-      <w:r>
-        <w:rPr>
-          <w:rFonts w:ascii="Arial" w:hAnsi="Arial" w:cs="Arial"/>
-        </w:rPr>
-        <w:t>mbora a plataforma</w:t>
-      </w:r>
-      <w:r>
-        <w:rPr>
-          <w:rFonts w:ascii="Arial" w:hAnsi="Arial" w:cs="Arial"/>
-        </w:rPr>
-        <w:t xml:space="preserve"> </w:t>
-      </w:r>
-      <w:r>
-        <w:rPr>
-          <w:rFonts w:ascii="Arial" w:hAnsi="Arial" w:cs="Arial"/>
-        </w:rPr>
-        <w:t>conecte pessoas distantes, elas muitas vezes falham em criar espaços digitais dinâmicos e intuitivos para o gerenciamento de núcleos específicos, como grupos familiares.</w:t>
-      </w:r>
+    </w:p>
+    <w:p>
+      <w:pPr>
+        <w:pStyle w:val="Ttulo1"/>
+        <w:rPr>
+          <w:b/>
+          <w:bCs/>
+        </w:rPr>
+      </w:pPr>
+      <w:bookmarkStart w:id="1" w:name="_Toc230100943"/>
+      <w:r>
+        <w:rPr>
+          <w:rFonts w:ascii="Arial" w:hAnsi="Arial" w:cs="Arial"/>
+          <w:b/>
+          <w:bCs/>
+          <w:color w:val="auto"/>
+          <w:sz w:val="24"/>
+          <w:szCs w:val="24"/>
+        </w:rPr>
+        <w:t xml:space="preserve">2. </w:t>
+      </w:r>
+      <w:r>
+        <w:rPr>
+          <w:rFonts w:ascii="Arial" w:hAnsi="Arial" w:cs="Arial"/>
+          <w:b/>
+          <w:bCs/>
+          <w:color w:val="auto"/>
+          <w:sz w:val="24"/>
+          <w:szCs w:val="24"/>
+        </w:rPr>
+        <w:t>OBJETIVO</w:t>
+      </w:r>
+      <w:bookmarkEnd w:id="1"/>
     </w:p>
     <w:p>
       <w:pPr>
@@ -333,47 +1154,39 @@
           <w:rFonts w:ascii="Arial" w:hAnsi="Arial" w:cs="Arial"/>
         </w:rPr>
       </w:pPr>
-      <w:r>
-        <w:rPr>
-          <w:rFonts w:ascii="Arial" w:hAnsi="Arial" w:cs="Arial"/>
-        </w:rPr>
-        <w:t>O desafio</w:t>
-      </w:r>
-      <w:r>
-        <w:rPr>
-          <w:rFonts w:ascii="Arial" w:hAnsi="Arial" w:cs="Arial"/>
-        </w:rPr>
-        <w:t xml:space="preserve"> então </w:t>
-      </w:r>
-      <w:r>
-        <w:rPr>
-          <w:rFonts w:ascii="Arial" w:hAnsi="Arial" w:cs="Arial"/>
-        </w:rPr>
-        <w:t xml:space="preserve">reside na falta de um guia ou assistente personalizado que consiga atuar em tempo real, interpretando o comportamento e as preferências do usuário para tornar a navegação útil e interativa, </w:t>
-      </w:r>
-      <w:r>
-        <w:rPr>
-          <w:rFonts w:ascii="Arial" w:hAnsi="Arial" w:cs="Arial"/>
-        </w:rPr>
-        <w:t xml:space="preserve">gerando recompensas, </w:t>
-      </w:r>
-      <w:r>
-        <w:rPr>
-          <w:rFonts w:ascii="Arial" w:hAnsi="Arial" w:cs="Arial"/>
-        </w:rPr>
-        <w:t xml:space="preserve">sem que isso resulte em </w:t>
-      </w:r>
-      <w:r>
-        <w:rPr>
-          <w:rFonts w:ascii="Arial" w:hAnsi="Arial" w:cs="Arial"/>
-        </w:rPr>
-        <w:t xml:space="preserve">altos </w:t>
-      </w:r>
-      <w:r>
-        <w:rPr>
-          <w:rFonts w:ascii="Arial" w:hAnsi="Arial" w:cs="Arial"/>
-        </w:rPr>
-        <w:t>custos de infraestrutura ou perda de performance da plataforma.</w:t>
+    </w:p>
+    <w:p>
+      <w:pPr>
+        <w:spacing w:after="0" w:line="360" w:lineRule="auto"/>
+        <w:ind w:left="284"/>
+        <w:jc w:val="both"/>
+        <w:rPr>
+          <w:rFonts w:ascii="Arial" w:hAnsi="Arial" w:cs="Arial"/>
+        </w:rPr>
+      </w:pPr>
+      <w:r>
+        <w:rPr>
+          <w:rFonts w:ascii="Arial" w:hAnsi="Arial" w:cs="Arial"/>
+        </w:rPr>
+        <w:t>Apresentar a modelagem conceitual e a arquitetura de banco de dados propostas para a plataforma, demonstrando como a estrutura de entidades atende aos requisitos de escalabilidade, performance em tempo real</w:t>
+      </w:r>
+      <w:r>
+        <w:rPr>
+          <w:rFonts w:ascii="Arial" w:hAnsi="Arial" w:cs="Arial"/>
+        </w:rPr>
+        <w:t xml:space="preserve"> e histórico de engajamento alimentando a</w:t>
+      </w:r>
+      <w:r>
+        <w:rPr>
+          <w:rFonts w:ascii="Arial" w:hAnsi="Arial" w:cs="Arial"/>
+        </w:rPr>
+        <w:t xml:space="preserve"> memória do avatar inteligente</w:t>
+      </w:r>
+      <w:r>
+        <w:rPr>
+          <w:rFonts w:ascii="Arial" w:hAnsi="Arial" w:cs="Arial"/>
+        </w:rPr>
+        <w:t>.</w:t>
       </w:r>
     </w:p>
     <w:p>
@@ -385,43 +1198,406 @@
           <w:rFonts w:ascii="Arial" w:hAnsi="Arial" w:cs="Arial"/>
         </w:rPr>
       </w:pPr>
-      <w:r>
-        <w:rPr>
-          <w:rFonts w:ascii="Arial" w:hAnsi="Arial" w:cs="Arial"/>
-        </w:rPr>
-        <w:t xml:space="preserve">A Eco Pulse apresenta o </w:t>
+    </w:p>
+    <w:p>
+      <w:pPr>
+        <w:pStyle w:val="Ttulo1"/>
+        <w:rPr>
+          <w:rFonts w:ascii="Arial" w:hAnsi="Arial" w:cs="Arial"/>
+          <w:b/>
+          <w:bCs/>
+          <w:color w:val="auto"/>
+          <w:sz w:val="24"/>
+          <w:szCs w:val="24"/>
+        </w:rPr>
+      </w:pPr>
+      <w:bookmarkStart w:id="2" w:name="_Toc230100944"/>
+      <w:r>
+        <w:rPr>
+          <w:rFonts w:ascii="Arial" w:hAnsi="Arial" w:cs="Arial"/>
+          <w:b/>
+          <w:bCs/>
+          <w:color w:val="auto"/>
+          <w:sz w:val="24"/>
+          <w:szCs w:val="24"/>
+        </w:rPr>
+        <w:t xml:space="preserve">3. </w:t>
+      </w:r>
+      <w:r>
+        <w:rPr>
+          <w:rFonts w:ascii="Arial" w:hAnsi="Arial" w:cs="Arial"/>
+          <w:b/>
+          <w:bCs/>
+          <w:color w:val="auto"/>
+          <w:sz w:val="24"/>
+          <w:szCs w:val="24"/>
+        </w:rPr>
+        <w:t>PRINCIPAIS ENTIDADES DO SISTEMA</w:t>
+      </w:r>
+      <w:bookmarkEnd w:id="2"/>
+    </w:p>
+    <w:p>
+      <w:pPr>
+        <w:pStyle w:val="PargrafodaLista"/>
+        <w:spacing w:after="0" w:line="360" w:lineRule="auto"/>
+        <w:jc w:val="both"/>
+        <w:rPr>
+          <w:rFonts w:ascii="Arial" w:hAnsi="Arial" w:cs="Arial"/>
+        </w:rPr>
+      </w:pPr>
+    </w:p>
+    <w:p>
+      <w:pPr>
+        <w:pStyle w:val="PargrafodaLista"/>
+        <w:spacing w:after="120" w:line="360" w:lineRule="auto"/>
+        <w:ind w:left="284"/>
+        <w:jc w:val="both"/>
+        <w:rPr>
+          <w:rFonts w:ascii="Arial" w:hAnsi="Arial" w:cs="Arial"/>
+        </w:rPr>
+      </w:pPr>
+      <w:r>
+        <w:rPr>
+          <w:rStyle w:val="Estilo2Char"/>
+        </w:rPr>
+        <w:t>3.1.</w:t>
+      </w:r>
+      <w:r>
+        <w:rPr>
+          <w:rStyle w:val="Estilo2Char"/>
+        </w:rPr>
+        <w:t xml:space="preserve"> </w:t>
       </w:r>
       <w:proofErr w:type="spellStart"/>
       <w:r>
         <w:rPr>
-          <w:rFonts w:ascii="Arial" w:hAnsi="Arial" w:cs="Arial"/>
-        </w:rPr>
-        <w:t>Souly</w:t>
+          <w:rStyle w:val="Estilo2Char"/>
+        </w:rPr>
+        <w:t>Usuario</w:t>
       </w:r>
       <w:proofErr w:type="spellEnd"/>
       <w:r>
         <w:rPr>
-          <w:rFonts w:ascii="Arial" w:hAnsi="Arial" w:cs="Arial"/>
-        </w:rPr>
-        <w:t xml:space="preserve"> um</w:t>
-      </w:r>
-      <w:r>
-        <w:rPr>
-          <w:rFonts w:ascii="Arial" w:hAnsi="Arial" w:cs="Arial"/>
-        </w:rPr>
-        <w:t xml:space="preserve"> avatar inteligente </w:t>
-      </w:r>
-      <w:r>
-        <w:rPr>
-          <w:rFonts w:ascii="Arial" w:hAnsi="Arial" w:cs="Arial"/>
-        </w:rPr>
-        <w:t xml:space="preserve">que </w:t>
-      </w:r>
-      <w:r>
-        <w:rPr>
-          <w:rFonts w:ascii="Arial" w:hAnsi="Arial" w:cs="Arial"/>
-        </w:rPr>
-        <w:t>atua como um assistente dentro da plataforma, tornando a experiência mais interativa e engajadora.</w:t>
+          <w:rStyle w:val="Estilo2Char"/>
+        </w:rPr>
+        <w:t>:</w:t>
+      </w:r>
+      <w:r>
+        <w:rPr>
+          <w:rFonts w:ascii="Arial" w:hAnsi="Arial" w:cs="Arial"/>
+        </w:rPr>
+        <w:t xml:space="preserve"> </w:t>
+      </w:r>
+      <w:r>
+        <w:rPr>
+          <w:rFonts w:ascii="Arial" w:hAnsi="Arial" w:cs="Arial"/>
+        </w:rPr>
+        <w:t>Entidade central que armazena os dados cadastrais, credenciais e o papel do indivíduo na plataforma.</w:t>
+      </w:r>
+    </w:p>
+    <w:p>
+      <w:pPr>
+        <w:spacing w:after="120" w:line="360" w:lineRule="auto"/>
+        <w:ind w:left="284"/>
+        <w:jc w:val="both"/>
+        <w:rPr>
+          <w:rFonts w:ascii="Arial" w:hAnsi="Arial" w:cs="Arial"/>
+        </w:rPr>
+      </w:pPr>
+      <w:r>
+        <w:rPr>
+          <w:rStyle w:val="Estilo2Char"/>
+        </w:rPr>
+        <w:t>3.2.</w:t>
+      </w:r>
+      <w:r>
+        <w:rPr>
+          <w:rStyle w:val="Estilo2Char"/>
+        </w:rPr>
+        <w:t xml:space="preserve"> Família:</w:t>
+      </w:r>
+      <w:r>
+        <w:rPr>
+          <w:rFonts w:ascii="Arial" w:hAnsi="Arial" w:cs="Arial"/>
+        </w:rPr>
+        <w:t xml:space="preserve"> </w:t>
+      </w:r>
+      <w:r>
+        <w:rPr>
+          <w:rFonts w:ascii="Arial" w:hAnsi="Arial" w:cs="Arial"/>
+        </w:rPr>
+        <w:t>Entidade responsável por agrupar os usuários em núcleos ou mapear conexões de parentesco, permitindo interações segmentadas.</w:t>
+      </w:r>
+    </w:p>
+    <w:p>
+      <w:pPr>
+        <w:spacing w:after="120" w:line="360" w:lineRule="auto"/>
+        <w:ind w:left="284"/>
+        <w:jc w:val="both"/>
+        <w:rPr>
+          <w:rFonts w:ascii="Arial" w:hAnsi="Arial" w:cs="Arial"/>
+        </w:rPr>
+      </w:pPr>
+      <w:r>
+        <w:rPr>
+          <w:rStyle w:val="Estilo2Char"/>
+        </w:rPr>
+        <w:t>3.3.</w:t>
+      </w:r>
+      <w:r>
+        <w:rPr>
+          <w:rStyle w:val="Estilo2Char"/>
+        </w:rPr>
+        <w:t xml:space="preserve"> Post:</w:t>
+      </w:r>
+      <w:r>
+        <w:rPr>
+          <w:rFonts w:ascii="Arial" w:hAnsi="Arial" w:cs="Arial"/>
+        </w:rPr>
+        <w:t xml:space="preserve"> Entidade que armazena as publicações, comentários e respostas na rede social.</w:t>
+      </w:r>
+    </w:p>
+    <w:p>
+      <w:pPr>
+        <w:spacing w:after="120" w:line="360" w:lineRule="auto"/>
+        <w:ind w:left="284"/>
+        <w:jc w:val="both"/>
+        <w:rPr>
+          <w:rFonts w:ascii="Arial" w:hAnsi="Arial" w:cs="Arial"/>
+        </w:rPr>
+      </w:pPr>
+      <w:r>
+        <w:rPr>
+          <w:rStyle w:val="Estilo2Char"/>
+        </w:rPr>
+        <w:t>3.4.</w:t>
+      </w:r>
+      <w:r>
+        <w:rPr>
+          <w:rFonts w:ascii="Arial" w:hAnsi="Arial" w:cs="Arial"/>
+          <w:b/>
+          <w:bCs/>
+        </w:rPr>
+        <w:t xml:space="preserve"> Comunidade:</w:t>
+      </w:r>
+      <w:r>
+        <w:rPr>
+          <w:rFonts w:ascii="Arial" w:hAnsi="Arial" w:cs="Arial"/>
+        </w:rPr>
+        <w:t xml:space="preserve"> Diferentemente da entidade </w:t>
+      </w:r>
+      <w:proofErr w:type="spellStart"/>
+      <w:r>
+        <w:rPr>
+          <w:rFonts w:ascii="Arial" w:hAnsi="Arial" w:cs="Arial"/>
+        </w:rPr>
+        <w:t>Familia</w:t>
+      </w:r>
+      <w:proofErr w:type="spellEnd"/>
+      <w:r>
+        <w:rPr>
+          <w:rFonts w:ascii="Arial" w:hAnsi="Arial" w:cs="Arial"/>
+        </w:rPr>
+        <w:t xml:space="preserve">, a comunidade </w:t>
+      </w:r>
+      <w:r>
+        <w:rPr>
+          <w:rFonts w:ascii="Arial" w:hAnsi="Arial" w:cs="Arial"/>
+        </w:rPr>
+        <w:t xml:space="preserve">serve para conectar usuários </w:t>
+      </w:r>
+      <w:r>
+        <w:rPr>
+          <w:rFonts w:ascii="Arial" w:hAnsi="Arial" w:cs="Arial"/>
+        </w:rPr>
+        <w:t xml:space="preserve">com </w:t>
+      </w:r>
+      <w:r>
+        <w:rPr>
+          <w:rFonts w:ascii="Arial" w:hAnsi="Arial" w:cs="Arial"/>
+        </w:rPr>
+        <w:t>interesses comuns (</w:t>
+      </w:r>
+      <w:proofErr w:type="spellStart"/>
+      <w:r>
+        <w:rPr>
+          <w:rFonts w:ascii="Arial" w:hAnsi="Arial" w:cs="Arial"/>
+        </w:rPr>
+        <w:t>ex</w:t>
+      </w:r>
+      <w:proofErr w:type="spellEnd"/>
+      <w:r>
+        <w:rPr>
+          <w:rFonts w:ascii="Arial" w:hAnsi="Arial" w:cs="Arial"/>
+        </w:rPr>
+        <w:t>: tecnologia, educação, hobbies, esportes).</w:t>
+      </w:r>
+    </w:p>
+    <w:p>
+      <w:pPr>
+        <w:spacing w:after="120" w:line="360" w:lineRule="auto"/>
+        <w:ind w:left="284"/>
+        <w:jc w:val="both"/>
+        <w:rPr>
+          <w:rFonts w:ascii="Arial" w:hAnsi="Arial" w:cs="Arial"/>
+        </w:rPr>
+      </w:pPr>
+      <w:r>
+        <w:rPr>
+          <w:rStyle w:val="Estilo2Char"/>
+        </w:rPr>
+        <w:lastRenderedPageBreak/>
+        <w:t>3.5.</w:t>
+      </w:r>
+      <w:r>
+        <w:rPr>
+          <w:rStyle w:val="Estilo2Char"/>
+        </w:rPr>
+        <w:t xml:space="preserve"> </w:t>
+      </w:r>
+      <w:proofErr w:type="spellStart"/>
+      <w:r>
+        <w:rPr>
+          <w:rStyle w:val="Estilo2Char"/>
+        </w:rPr>
+        <w:t>Historico_conversa</w:t>
+      </w:r>
+      <w:proofErr w:type="spellEnd"/>
+      <w:r>
+        <w:rPr>
+          <w:rStyle w:val="Estilo2Char"/>
+        </w:rPr>
+        <w:t>:</w:t>
+      </w:r>
+      <w:r>
+        <w:rPr>
+          <w:rFonts w:ascii="Arial" w:hAnsi="Arial" w:cs="Arial"/>
+        </w:rPr>
+        <w:t xml:space="preserve"> Entidade responsável por armazenar</w:t>
+      </w:r>
+      <w:r>
+        <w:rPr>
+          <w:rFonts w:ascii="Arial" w:hAnsi="Arial" w:cs="Arial"/>
+        </w:rPr>
+        <w:t xml:space="preserve"> as conversas íntimas, confidenciais e imediatas entre dois usuários.</w:t>
+      </w:r>
+    </w:p>
+    <w:p>
+      <w:pPr>
+        <w:spacing w:after="120" w:line="360" w:lineRule="auto"/>
+        <w:ind w:left="284"/>
+        <w:jc w:val="both"/>
+        <w:rPr>
+          <w:rFonts w:ascii="Arial" w:hAnsi="Arial" w:cs="Arial"/>
+        </w:rPr>
+      </w:pPr>
+      <w:r>
+        <w:rPr>
+          <w:rStyle w:val="Estilo2Char"/>
+        </w:rPr>
+        <w:t>3.6.</w:t>
+      </w:r>
+      <w:r>
+        <w:rPr>
+          <w:rStyle w:val="Estilo2Char"/>
+        </w:rPr>
+        <w:t xml:space="preserve"> </w:t>
+      </w:r>
+      <w:r>
+        <w:rPr>
+          <w:rStyle w:val="Estilo2Char"/>
+        </w:rPr>
+        <w:t>Contadores:</w:t>
+      </w:r>
+      <w:r>
+        <w:rPr>
+          <w:rFonts w:ascii="Arial" w:hAnsi="Arial" w:cs="Arial"/>
+        </w:rPr>
+        <w:t xml:space="preserve"> Responsável por armazenar a quantidade de curtidas, mensagens, posts e compartilhamentos. Vai dar suporte à memória do Avatar.</w:t>
+      </w:r>
+    </w:p>
+    <w:p>
+      <w:pPr>
+        <w:spacing w:after="0" w:line="360" w:lineRule="auto"/>
+        <w:ind w:left="284"/>
+        <w:jc w:val="both"/>
+        <w:rPr>
+          <w:rFonts w:ascii="Arial" w:hAnsi="Arial" w:cs="Arial"/>
+        </w:rPr>
+      </w:pPr>
+      <w:r>
+        <w:rPr>
+          <w:rStyle w:val="Estilo2Char"/>
+        </w:rPr>
+        <w:t>3.7.</w:t>
+      </w:r>
+      <w:r>
+        <w:rPr>
+          <w:rStyle w:val="Estilo2Char"/>
+        </w:rPr>
+        <w:t xml:space="preserve"> Desafio:</w:t>
+      </w:r>
+      <w:r>
+        <w:rPr>
+          <w:rFonts w:ascii="Arial" w:hAnsi="Arial" w:cs="Arial"/>
+          <w:b/>
+          <w:bCs/>
+        </w:rPr>
+        <w:t xml:space="preserve"> </w:t>
+      </w:r>
+      <w:r>
+        <w:rPr>
+          <w:rFonts w:ascii="Arial" w:hAnsi="Arial" w:cs="Arial"/>
+        </w:rPr>
+        <w:t xml:space="preserve">Armazena os tipos de problemas solucionáveis propostos pela plataforma </w:t>
+      </w:r>
+      <w:r>
+        <w:rPr>
+          <w:rFonts w:ascii="Arial" w:hAnsi="Arial" w:cs="Arial"/>
+        </w:rPr>
+        <w:t>serv</w:t>
+      </w:r>
+      <w:r>
+        <w:rPr>
+          <w:rFonts w:ascii="Arial" w:hAnsi="Arial" w:cs="Arial"/>
+        </w:rPr>
+        <w:t>indo de</w:t>
+      </w:r>
+      <w:r>
+        <w:rPr>
+          <w:rFonts w:ascii="Arial" w:hAnsi="Arial" w:cs="Arial"/>
+        </w:rPr>
+        <w:t xml:space="preserve"> motor </w:t>
+      </w:r>
+      <w:r>
+        <w:rPr>
+          <w:rFonts w:ascii="Arial" w:hAnsi="Arial" w:cs="Arial"/>
+        </w:rPr>
+        <w:t xml:space="preserve">para </w:t>
+      </w:r>
+      <w:r>
+        <w:rPr>
+          <w:rFonts w:ascii="Arial" w:hAnsi="Arial" w:cs="Arial"/>
+        </w:rPr>
+        <w:t xml:space="preserve">ações estruturadas </w:t>
+      </w:r>
+      <w:r>
+        <w:rPr>
+          <w:rFonts w:ascii="Arial" w:hAnsi="Arial" w:cs="Arial"/>
+        </w:rPr>
+        <w:t xml:space="preserve">gerando </w:t>
+      </w:r>
+      <w:r>
+        <w:rPr>
+          <w:rFonts w:ascii="Arial" w:hAnsi="Arial" w:cs="Arial"/>
+        </w:rPr>
+        <w:t>novas interações.</w:t>
+      </w:r>
+      <w:r>
+        <w:rPr>
+          <w:rFonts w:ascii="Arial" w:hAnsi="Arial" w:cs="Arial"/>
+        </w:rPr>
+        <w:t xml:space="preserve"> Pode ser tipificado como uma gamificação.</w:t>
       </w:r>
     </w:p>
     <w:p>
@@ -436,127 +1612,40 @@
     </w:p>
     <w:p>
       <w:pPr>
-        <w:spacing w:after="0" w:line="360" w:lineRule="auto"/>
-        <w:ind w:left="357"/>
-        <w:jc w:val="both"/>
-        <w:rPr>
-          <w:rFonts w:ascii="Arial" w:hAnsi="Arial" w:cs="Arial"/>
-        </w:rPr>
-      </w:pPr>
-    </w:p>
-    <w:p>
-      <w:pPr>
-        <w:pStyle w:val="PargrafodaLista"/>
-        <w:numPr>
-          <w:ilvl w:val="0"/>
-          <w:numId w:val="1"/>
-        </w:numPr>
-        <w:spacing w:after="0" w:line="360" w:lineRule="auto"/>
-        <w:ind w:left="357"/>
-        <w:jc w:val="both"/>
+        <w:pStyle w:val="Ttulo1"/>
         <w:rPr>
           <w:rFonts w:ascii="Arial" w:hAnsi="Arial" w:cs="Arial"/>
           <w:b/>
           <w:bCs/>
-        </w:rPr>
-      </w:pPr>
+          <w:color w:val="auto"/>
+          <w:sz w:val="24"/>
+          <w:szCs w:val="24"/>
+        </w:rPr>
+      </w:pPr>
+      <w:bookmarkStart w:id="3" w:name="_Toc230100945"/>
       <w:r>
         <w:rPr>
           <w:rFonts w:ascii="Arial" w:hAnsi="Arial" w:cs="Arial"/>
           <w:b/>
           <w:bCs/>
-        </w:rPr>
-        <w:t>OBJETIVO</w:t>
-      </w:r>
-    </w:p>
-    <w:p>
-      <w:pPr>
-        <w:spacing w:after="0" w:line="360" w:lineRule="auto"/>
-        <w:ind w:left="357"/>
-        <w:jc w:val="both"/>
-        <w:rPr>
-          <w:rFonts w:ascii="Arial" w:hAnsi="Arial" w:cs="Arial"/>
-        </w:rPr>
-      </w:pPr>
-    </w:p>
-    <w:p>
-      <w:pPr>
-        <w:spacing w:after="0" w:line="360" w:lineRule="auto"/>
-        <w:ind w:left="357"/>
-        <w:jc w:val="both"/>
-        <w:rPr>
-          <w:rFonts w:ascii="Arial" w:hAnsi="Arial" w:cs="Arial"/>
-        </w:rPr>
-      </w:pPr>
-      <w:r>
-        <w:rPr>
-          <w:rFonts w:ascii="Arial" w:hAnsi="Arial" w:cs="Arial"/>
-        </w:rPr>
-        <w:t>Apresentar a modelagem conceitual e a arquitetura de banco de dados propostas para a plataforma, demonstrando como a estrutura de entidades atende aos requisitos de escalabilidade, performance em tempo real</w:t>
-      </w:r>
-      <w:r>
-        <w:rPr>
-          <w:rFonts w:ascii="Arial" w:hAnsi="Arial" w:cs="Arial"/>
-        </w:rPr>
-        <w:t xml:space="preserve"> e histórico de engajamento alimentando a</w:t>
-      </w:r>
-      <w:r>
-        <w:rPr>
-          <w:rFonts w:ascii="Arial" w:hAnsi="Arial" w:cs="Arial"/>
-        </w:rPr>
-        <w:t xml:space="preserve"> memória do avatar inteligente</w:t>
-      </w:r>
-      <w:r>
-        <w:rPr>
-          <w:rFonts w:ascii="Arial" w:hAnsi="Arial" w:cs="Arial"/>
-        </w:rPr>
-        <w:t>.</w:t>
-      </w:r>
-    </w:p>
-    <w:p>
-      <w:pPr>
-        <w:spacing w:after="0" w:line="360" w:lineRule="auto"/>
-        <w:ind w:left="357"/>
-        <w:jc w:val="both"/>
-        <w:rPr>
-          <w:rFonts w:ascii="Arial" w:hAnsi="Arial" w:cs="Arial"/>
-        </w:rPr>
-      </w:pPr>
-    </w:p>
-    <w:p>
-      <w:pPr>
-        <w:spacing w:after="0" w:line="360" w:lineRule="auto"/>
-        <w:ind w:left="357"/>
-        <w:jc w:val="both"/>
-        <w:rPr>
-          <w:rFonts w:ascii="Arial" w:hAnsi="Arial" w:cs="Arial"/>
-        </w:rPr>
-      </w:pPr>
-    </w:p>
-    <w:p>
-      <w:pPr>
-        <w:pStyle w:val="PargrafodaLista"/>
-        <w:numPr>
-          <w:ilvl w:val="0"/>
-          <w:numId w:val="1"/>
-        </w:numPr>
-        <w:spacing w:after="0" w:line="360" w:lineRule="auto"/>
-        <w:ind w:left="357" w:hanging="357"/>
-        <w:jc w:val="both"/>
+          <w:color w:val="auto"/>
+          <w:sz w:val="24"/>
+          <w:szCs w:val="24"/>
+        </w:rPr>
+        <w:t xml:space="preserve">4. </w:t>
+      </w:r>
+      <w:r>
         <w:rPr>
           <w:rFonts w:ascii="Arial" w:hAnsi="Arial" w:cs="Arial"/>
           <w:b/>
           <w:bCs/>
-        </w:rPr>
-      </w:pPr>
-      <w:r>
-        <w:rPr>
-          <w:rFonts w:ascii="Arial" w:hAnsi="Arial" w:cs="Arial"/>
-          <w:b/>
-          <w:bCs/>
-        </w:rPr>
-        <w:t>PRINCIPAIS ENTIDADES DO SISTEMA</w:t>
-      </w:r>
+          <w:color w:val="auto"/>
+          <w:sz w:val="24"/>
+          <w:szCs w:val="24"/>
+        </w:rPr>
+        <w:t>REGRAS DE NEGÓCIO</w:t>
+      </w:r>
+      <w:bookmarkEnd w:id="3"/>
     </w:p>
     <w:p>
       <w:pPr>
@@ -570,749 +1659,276 @@
     </w:p>
     <w:p>
       <w:pPr>
-        <w:pStyle w:val="PargrafodaLista"/>
+        <w:spacing w:after="120" w:line="360" w:lineRule="auto"/>
+        <w:ind w:left="284"/>
+        <w:jc w:val="both"/>
+      </w:pPr>
+      <w:r>
+        <w:rPr>
+          <w:rStyle w:val="Estilo2Char"/>
+        </w:rPr>
+        <w:t>4.1.</w:t>
+      </w:r>
+      <w:r>
+        <w:rPr>
+          <w:rStyle w:val="Estilo2Char"/>
+        </w:rPr>
+        <w:t xml:space="preserve"> </w:t>
+      </w:r>
+      <w:r>
+        <w:rPr>
+          <w:rStyle w:val="Estilo2Char"/>
+        </w:rPr>
+        <w:t>Do Avatar</w:t>
+      </w:r>
+      <w:r>
+        <w:rPr>
+          <w:rStyle w:val="Estilo2Char"/>
+        </w:rPr>
+        <w:t>:</w:t>
+      </w:r>
+      <w:r>
+        <w:t xml:space="preserve"> </w:t>
+      </w:r>
+      <w:r>
+        <w:t xml:space="preserve">Responsável por interagir com o </w:t>
+      </w:r>
+      <w:r>
+        <w:t xml:space="preserve">usuário ativo </w:t>
+      </w:r>
+      <w:r>
+        <w:t>atuando como um guia sobre a interação deste com a plataforma. Pode apresentar sugestões dependendo das interações do usuário;</w:t>
+      </w:r>
+    </w:p>
+    <w:p>
+      <w:pPr>
+        <w:spacing w:after="120" w:line="360" w:lineRule="auto"/>
+        <w:ind w:left="284"/>
+        <w:jc w:val="both"/>
+      </w:pPr>
+      <w:r>
+        <w:rPr>
+          <w:rStyle w:val="Estilo2Char"/>
+        </w:rPr>
+        <w:t>4.2.</w:t>
+      </w:r>
+      <w:r>
+        <w:rPr>
+          <w:rStyle w:val="Estilo2Char"/>
+        </w:rPr>
+        <w:t xml:space="preserve"> Atribuição de Autoria de Posts:</w:t>
+      </w:r>
+      <w:r>
+        <w:t xml:space="preserve"> Todo post registrado no sistema deve identificar obrigatoriamente o usuário autor (</w:t>
+      </w:r>
+      <w:proofErr w:type="spellStart"/>
+      <w:r>
+        <w:t>id_usuario</w:t>
+      </w:r>
+      <w:proofErr w:type="spellEnd"/>
+      <w:r>
+        <w:t xml:space="preserve"> para fins de auditoria e métricas de engajamento.</w:t>
+      </w:r>
+    </w:p>
+    <w:p>
+      <w:pPr>
+        <w:spacing w:after="120" w:line="360" w:lineRule="auto"/>
+        <w:ind w:left="284"/>
+        <w:jc w:val="both"/>
+      </w:pPr>
+      <w:r>
+        <w:rPr>
+          <w:rStyle w:val="Estilo2Char"/>
+        </w:rPr>
+        <w:t xml:space="preserve">4.3. </w:t>
+      </w:r>
+      <w:r>
+        <w:rPr>
+          <w:rStyle w:val="Estilo2Char"/>
+        </w:rPr>
+        <w:t>Autorreferência de Comentários:</w:t>
+      </w:r>
+      <w:r>
+        <w:t xml:space="preserve"> Um comentário é tratado nativamente como um post. Para ser considerado um comentário ou resposta, a entidade Post deve obrigatoriamente apontar para um </w:t>
+      </w:r>
+      <w:proofErr w:type="spellStart"/>
+      <w:r>
+        <w:t>id_post_pai</w:t>
+      </w:r>
+      <w:proofErr w:type="spellEnd"/>
+      <w:r>
+        <w:t xml:space="preserve"> existente. </w:t>
+      </w:r>
+    </w:p>
+    <w:p>
+      <w:pPr>
+        <w:spacing w:after="120" w:line="360" w:lineRule="auto"/>
+        <w:ind w:left="284"/>
+        <w:jc w:val="both"/>
+      </w:pPr>
+      <w:r>
+        <w:rPr>
+          <w:rStyle w:val="Estilo2Char"/>
+        </w:rPr>
+        <w:t>4.4. Atribuição de Autoria de Comunidade</w:t>
+      </w:r>
+      <w:r>
+        <w:rPr>
+          <w:rStyle w:val="Estilo2Char"/>
+        </w:rPr>
+        <w:t>:</w:t>
+      </w:r>
+      <w:r>
+        <w:t xml:space="preserve"> </w:t>
+      </w:r>
+      <w:r>
+        <w:t>D</w:t>
+      </w:r>
+      <w:r>
+        <w:t>efine formalmente quem possui o direito de propriedade, moderação e controle sobre uma comunidade criada dentro da plataforma, além de estabelecer como o sistema registra essa responsabilidade no banco de dados.</w:t>
+      </w:r>
+    </w:p>
+    <w:p>
+      <w:pPr>
+        <w:spacing w:after="120" w:line="360" w:lineRule="auto"/>
+        <w:ind w:left="284"/>
+        <w:jc w:val="both"/>
+      </w:pPr>
+      <w:r>
+        <w:rPr>
+          <w:rStyle w:val="Estilo2Char"/>
+        </w:rPr>
+        <w:t>4.5.</w:t>
+      </w:r>
+      <w:r>
+        <w:rPr>
+          <w:rStyle w:val="Estilo2Char"/>
+        </w:rPr>
+        <w:t xml:space="preserve"> Unicidade de Engajamento:</w:t>
+      </w:r>
+      <w:r>
+        <w:t xml:space="preserve"> Um usuário só pode registrar uma única curtida por post. O sistema deve validar a chave composta (</w:t>
+      </w:r>
+      <w:proofErr w:type="spellStart"/>
+      <w:r>
+        <w:t>id_usuario</w:t>
+      </w:r>
+      <w:proofErr w:type="spellEnd"/>
+      <w:r>
+        <w:t xml:space="preserve"> + </w:t>
+      </w:r>
+      <w:proofErr w:type="spellStart"/>
+      <w:r>
+        <w:t>id_post</w:t>
+      </w:r>
+      <w:proofErr w:type="spellEnd"/>
+      <w:r>
+        <w:t>) para impedir duplicidade de reações e garantir a integridade dos contadores de performance em tempo real.</w:t>
+      </w:r>
+    </w:p>
+    <w:p>
+      <w:pPr>
         <w:spacing w:after="120" w:line="360" w:lineRule="auto"/>
         <w:ind w:left="357"/>
-        <w:jc w:val="both"/>
-        <w:rPr>
-          <w:rFonts w:ascii="Arial" w:hAnsi="Arial" w:cs="Arial"/>
-        </w:rPr>
-      </w:pPr>
-      <w:r>
-        <w:rPr>
-          <w:rFonts w:ascii="Arial" w:hAnsi="Arial" w:cs="Arial"/>
+      </w:pPr>
+    </w:p>
+    <w:p>
+      <w:pPr>
+        <w:spacing w:after="120" w:line="360" w:lineRule="auto"/>
+        <w:ind w:left="357"/>
+      </w:pPr>
+    </w:p>
+    <w:p>
+      <w:pPr>
+        <w:spacing w:after="0"/>
+        <w:rPr>
           <w:b/>
           <w:bCs/>
         </w:rPr>
-        <w:t>3.1.</w:t>
-      </w:r>
-      <w:r>
-        <w:rPr>
-          <w:rFonts w:ascii="Arial" w:hAnsi="Arial" w:cs="Arial"/>
+      </w:pPr>
+    </w:p>
+    <w:p>
+      <w:pPr>
+        <w:spacing w:after="0"/>
+        <w:rPr>
           <w:b/>
           <w:bCs/>
         </w:rPr>
-        <w:t xml:space="preserve"> </w:t>
-      </w:r>
-      <w:proofErr w:type="spellStart"/>
-      <w:r>
-        <w:rPr>
-          <w:rFonts w:ascii="Arial" w:hAnsi="Arial" w:cs="Arial"/>
+      </w:pPr>
+    </w:p>
+    <w:p>
+      <w:pPr>
+        <w:spacing w:after="0"/>
+        <w:rPr>
           <w:b/>
           <w:bCs/>
         </w:rPr>
-        <w:t>Usuario</w:t>
-      </w:r>
-      <w:proofErr w:type="spellEnd"/>
-      <w:r>
-        <w:rPr>
-          <w:rFonts w:ascii="Arial" w:hAnsi="Arial" w:cs="Arial"/>
+      </w:pPr>
+    </w:p>
+    <w:p>
+      <w:pPr>
+        <w:spacing w:after="0"/>
+        <w:rPr>
           <w:b/>
           <w:bCs/>
         </w:rPr>
-        <w:t>:</w:t>
-      </w:r>
-      <w:r>
-        <w:rPr>
-          <w:rFonts w:ascii="Arial" w:hAnsi="Arial" w:cs="Arial"/>
-        </w:rPr>
-        <w:t xml:space="preserve"> </w:t>
-      </w:r>
-      <w:r>
-        <w:rPr>
-          <w:rFonts w:ascii="Arial" w:hAnsi="Arial" w:cs="Arial"/>
-        </w:rPr>
-        <w:t>Entidade central que armazena os dados cadastrais, credenciais e o papel do indivíduo na plataforma.</w:t>
-      </w:r>
-    </w:p>
-    <w:p>
-      <w:pPr>
-        <w:spacing w:after="120" w:line="360" w:lineRule="auto"/>
-        <w:ind w:left="357"/>
-        <w:jc w:val="both"/>
-        <w:rPr>
-          <w:rFonts w:ascii="Arial" w:hAnsi="Arial" w:cs="Arial"/>
-        </w:rPr>
-      </w:pPr>
-      <w:r>
-        <w:rPr>
-          <w:rFonts w:ascii="Arial" w:hAnsi="Arial" w:cs="Arial"/>
+      </w:pPr>
+    </w:p>
+    <w:p>
+      <w:pPr>
+        <w:spacing w:after="0"/>
+        <w:rPr>
           <w:b/>
           <w:bCs/>
         </w:rPr>
-        <w:t>3.2.</w:t>
-      </w:r>
-      <w:r>
-        <w:rPr>
-          <w:rFonts w:ascii="Arial" w:hAnsi="Arial" w:cs="Arial"/>
+      </w:pPr>
+    </w:p>
+    <w:p>
+      <w:pPr>
+        <w:spacing w:after="0"/>
+        <w:rPr>
           <w:b/>
           <w:bCs/>
         </w:rPr>
-        <w:t xml:space="preserve"> </w:t>
-      </w:r>
-      <w:r>
+      </w:pPr>
+    </w:p>
+    <w:p>
+      <w:pPr>
+        <w:pStyle w:val="Ttulo1"/>
         <w:rPr>
           <w:rFonts w:ascii="Arial" w:hAnsi="Arial" w:cs="Arial"/>
           <w:b/>
           <w:bCs/>
-        </w:rPr>
-        <w:t>Família:</w:t>
-      </w:r>
-      <w:r>
-        <w:rPr>
-          <w:rFonts w:ascii="Arial" w:hAnsi="Arial" w:cs="Arial"/>
-        </w:rPr>
-        <w:t xml:space="preserve"> </w:t>
-      </w:r>
-      <w:r>
-        <w:rPr>
-          <w:rFonts w:ascii="Arial" w:hAnsi="Arial" w:cs="Arial"/>
-        </w:rPr>
-        <w:t>Entidade responsável por agrupar os usuários em núcleos ou mapear conexões de parentesco, permitindo interações segmentadas.</w:t>
-      </w:r>
-    </w:p>
-    <w:p>
-      <w:pPr>
-        <w:spacing w:after="120" w:line="360" w:lineRule="auto"/>
-        <w:ind w:left="357"/>
-        <w:jc w:val="both"/>
-        <w:rPr>
-          <w:rFonts w:ascii="Arial" w:hAnsi="Arial" w:cs="Arial"/>
-        </w:rPr>
-      </w:pPr>
+          <w:color w:val="auto"/>
+          <w:sz w:val="24"/>
+          <w:szCs w:val="24"/>
+        </w:rPr>
+      </w:pPr>
+      <w:bookmarkStart w:id="4" w:name="_Toc230100946"/>
       <w:r>
         <w:rPr>
           <w:rFonts w:ascii="Arial" w:hAnsi="Arial" w:cs="Arial"/>
           <w:b/>
           <w:bCs/>
-        </w:rPr>
-        <w:t>3.3.</w:t>
-      </w:r>
-      <w:r>
-        <w:rPr>
-          <w:rFonts w:ascii="Arial" w:hAnsi="Arial" w:cs="Arial"/>
-        </w:rPr>
-        <w:t xml:space="preserve"> </w:t>
+          <w:color w:val="auto"/>
+          <w:sz w:val="24"/>
+          <w:szCs w:val="24"/>
+        </w:rPr>
+        <w:lastRenderedPageBreak/>
+        <w:t xml:space="preserve">5. </w:t>
       </w:r>
       <w:r>
         <w:rPr>
           <w:rFonts w:ascii="Arial" w:hAnsi="Arial" w:cs="Arial"/>
           <w:b/>
           <w:bCs/>
-        </w:rPr>
-        <w:t>Post:</w:t>
-      </w:r>
-      <w:r>
-        <w:rPr>
-          <w:rFonts w:ascii="Arial" w:hAnsi="Arial" w:cs="Arial"/>
-        </w:rPr>
-        <w:t xml:space="preserve"> Entidade que armazena as publicações, comentários e respostas na rede social.</w:t>
-      </w:r>
-    </w:p>
-    <w:p>
-      <w:pPr>
-        <w:spacing w:after="120" w:line="360" w:lineRule="auto"/>
-        <w:ind w:left="357"/>
-        <w:jc w:val="both"/>
-        <w:rPr>
-          <w:rFonts w:ascii="Arial" w:hAnsi="Arial" w:cs="Arial"/>
-        </w:rPr>
-      </w:pPr>
-      <w:r>
-        <w:rPr>
-          <w:rFonts w:ascii="Arial" w:hAnsi="Arial" w:cs="Arial"/>
-          <w:b/>
-          <w:bCs/>
-        </w:rPr>
-        <w:t>3.4.</w:t>
-      </w:r>
-      <w:r>
-        <w:rPr>
-          <w:rFonts w:ascii="Arial" w:hAnsi="Arial" w:cs="Arial"/>
-          <w:b/>
-          <w:bCs/>
-        </w:rPr>
-        <w:t xml:space="preserve"> Comunidade:</w:t>
-      </w:r>
-      <w:r>
-        <w:rPr>
-          <w:rFonts w:ascii="Arial" w:hAnsi="Arial" w:cs="Arial"/>
-        </w:rPr>
-        <w:t xml:space="preserve"> Diferentemente da entidade </w:t>
-      </w:r>
-      <w:proofErr w:type="spellStart"/>
-      <w:r>
-        <w:rPr>
-          <w:rFonts w:ascii="Arial" w:hAnsi="Arial" w:cs="Arial"/>
-        </w:rPr>
-        <w:t>Familia</w:t>
-      </w:r>
-      <w:proofErr w:type="spellEnd"/>
-      <w:r>
-        <w:rPr>
-          <w:rFonts w:ascii="Arial" w:hAnsi="Arial" w:cs="Arial"/>
-        </w:rPr>
-        <w:t xml:space="preserve">, a comunidade </w:t>
-      </w:r>
-      <w:r>
-        <w:rPr>
-          <w:rFonts w:ascii="Arial" w:hAnsi="Arial" w:cs="Arial"/>
-        </w:rPr>
-        <w:t xml:space="preserve">serve para conectar usuários </w:t>
-      </w:r>
-      <w:r>
-        <w:rPr>
-          <w:rFonts w:ascii="Arial" w:hAnsi="Arial" w:cs="Arial"/>
-        </w:rPr>
-        <w:t xml:space="preserve">com </w:t>
-      </w:r>
-      <w:r>
-        <w:rPr>
-          <w:rFonts w:ascii="Arial" w:hAnsi="Arial" w:cs="Arial"/>
-        </w:rPr>
-        <w:t>interesses comuns (</w:t>
-      </w:r>
-      <w:proofErr w:type="spellStart"/>
-      <w:r>
-        <w:rPr>
-          <w:rFonts w:ascii="Arial" w:hAnsi="Arial" w:cs="Arial"/>
-        </w:rPr>
-        <w:t>ex</w:t>
-      </w:r>
-      <w:proofErr w:type="spellEnd"/>
-      <w:r>
-        <w:rPr>
-          <w:rFonts w:ascii="Arial" w:hAnsi="Arial" w:cs="Arial"/>
-        </w:rPr>
-        <w:t>: tecnologia, educação, hobbies, esportes).</w:t>
-      </w:r>
-    </w:p>
-    <w:p>
-      <w:pPr>
-        <w:spacing w:after="120" w:line="360" w:lineRule="auto"/>
-        <w:ind w:left="357"/>
-        <w:jc w:val="both"/>
-        <w:rPr>
-          <w:rFonts w:ascii="Arial" w:hAnsi="Arial" w:cs="Arial"/>
-        </w:rPr>
-      </w:pPr>
-      <w:r>
-        <w:rPr>
-          <w:rFonts w:ascii="Arial" w:hAnsi="Arial" w:cs="Arial"/>
-          <w:b/>
-          <w:bCs/>
-        </w:rPr>
-        <w:lastRenderedPageBreak/>
-        <w:t>3.5.</w:t>
-      </w:r>
-      <w:r>
-        <w:rPr>
-          <w:rFonts w:ascii="Arial" w:hAnsi="Arial" w:cs="Arial"/>
-          <w:b/>
-          <w:bCs/>
-        </w:rPr>
-        <w:t xml:space="preserve"> </w:t>
-      </w:r>
-      <w:proofErr w:type="spellStart"/>
-      <w:r>
-        <w:rPr>
-          <w:rFonts w:ascii="Arial" w:hAnsi="Arial" w:cs="Arial"/>
-          <w:b/>
-          <w:bCs/>
-        </w:rPr>
-        <w:t>Historico_conversa</w:t>
-      </w:r>
-      <w:proofErr w:type="spellEnd"/>
-      <w:r>
-        <w:rPr>
-          <w:rFonts w:ascii="Arial" w:hAnsi="Arial" w:cs="Arial"/>
-          <w:b/>
-          <w:bCs/>
-        </w:rPr>
-        <w:t>:</w:t>
-      </w:r>
-      <w:r>
-        <w:rPr>
-          <w:rFonts w:ascii="Arial" w:hAnsi="Arial" w:cs="Arial"/>
-        </w:rPr>
-        <w:t xml:space="preserve"> Entidade responsável por armazenar</w:t>
-      </w:r>
-      <w:r>
-        <w:rPr>
-          <w:rFonts w:ascii="Arial" w:hAnsi="Arial" w:cs="Arial"/>
-        </w:rPr>
-        <w:t xml:space="preserve"> as conversas íntimas, confidenciais e imediatas entre dois usuários.</w:t>
-      </w:r>
-    </w:p>
-    <w:p>
-      <w:pPr>
-        <w:spacing w:after="120" w:line="360" w:lineRule="auto"/>
-        <w:ind w:left="357"/>
-        <w:jc w:val="both"/>
-        <w:rPr>
-          <w:rFonts w:ascii="Arial" w:hAnsi="Arial" w:cs="Arial"/>
-        </w:rPr>
-      </w:pPr>
-      <w:r>
-        <w:rPr>
-          <w:rFonts w:ascii="Arial" w:hAnsi="Arial" w:cs="Arial"/>
-          <w:b/>
-          <w:bCs/>
-        </w:rPr>
-        <w:t>3.6.</w:t>
-      </w:r>
-      <w:r>
-        <w:rPr>
-          <w:rFonts w:ascii="Arial" w:hAnsi="Arial" w:cs="Arial"/>
-          <w:b/>
-          <w:bCs/>
-        </w:rPr>
-        <w:t xml:space="preserve"> </w:t>
-      </w:r>
-      <w:r>
-        <w:rPr>
-          <w:rFonts w:ascii="Arial" w:hAnsi="Arial" w:cs="Arial"/>
-          <w:b/>
-          <w:bCs/>
-        </w:rPr>
-        <w:t>Contadores:</w:t>
-      </w:r>
-      <w:r>
-        <w:rPr>
-          <w:rFonts w:ascii="Arial" w:hAnsi="Arial" w:cs="Arial"/>
-        </w:rPr>
-        <w:t xml:space="preserve"> Responsável por armazenar a quantidade de curtidas, mensagens, posts e compartilhamentos. Vai dar suporte à memória do Avatar.</w:t>
-      </w:r>
-    </w:p>
-    <w:p>
-      <w:pPr>
-        <w:spacing w:after="0" w:line="360" w:lineRule="auto"/>
-        <w:ind w:left="357"/>
-        <w:jc w:val="both"/>
-        <w:rPr>
-          <w:rFonts w:ascii="Arial" w:hAnsi="Arial" w:cs="Arial"/>
-        </w:rPr>
-      </w:pPr>
-      <w:r>
-        <w:rPr>
-          <w:rFonts w:ascii="Arial" w:hAnsi="Arial" w:cs="Arial"/>
-          <w:b/>
-          <w:bCs/>
-        </w:rPr>
-        <w:t>3.7.</w:t>
-      </w:r>
-      <w:r>
-        <w:rPr>
-          <w:rFonts w:ascii="Arial" w:hAnsi="Arial" w:cs="Arial"/>
-          <w:b/>
-          <w:bCs/>
-        </w:rPr>
-        <w:t xml:space="preserve"> Desafio: </w:t>
-      </w:r>
-      <w:r>
-        <w:rPr>
-          <w:rFonts w:ascii="Arial" w:hAnsi="Arial" w:cs="Arial"/>
-        </w:rPr>
-        <w:t xml:space="preserve">Armazena os tipos de problemas solucionáveis propostos pela plataforma </w:t>
-      </w:r>
-      <w:r>
-        <w:rPr>
-          <w:rFonts w:ascii="Arial" w:hAnsi="Arial" w:cs="Arial"/>
-        </w:rPr>
-        <w:t>serv</w:t>
-      </w:r>
-      <w:r>
-        <w:rPr>
-          <w:rFonts w:ascii="Arial" w:hAnsi="Arial" w:cs="Arial"/>
-        </w:rPr>
-        <w:t>indo de</w:t>
-      </w:r>
-      <w:r>
-        <w:rPr>
-          <w:rFonts w:ascii="Arial" w:hAnsi="Arial" w:cs="Arial"/>
-        </w:rPr>
-        <w:t xml:space="preserve"> motor </w:t>
-      </w:r>
-      <w:r>
-        <w:rPr>
-          <w:rFonts w:ascii="Arial" w:hAnsi="Arial" w:cs="Arial"/>
-        </w:rPr>
-        <w:t xml:space="preserve">para </w:t>
-      </w:r>
-      <w:r>
-        <w:rPr>
-          <w:rFonts w:ascii="Arial" w:hAnsi="Arial" w:cs="Arial"/>
-        </w:rPr>
-        <w:t xml:space="preserve">ações estruturadas </w:t>
-      </w:r>
-      <w:r>
-        <w:rPr>
-          <w:rFonts w:ascii="Arial" w:hAnsi="Arial" w:cs="Arial"/>
-        </w:rPr>
-        <w:t xml:space="preserve">gerando </w:t>
-      </w:r>
-      <w:r>
-        <w:rPr>
-          <w:rFonts w:ascii="Arial" w:hAnsi="Arial" w:cs="Arial"/>
-        </w:rPr>
-        <w:t>novas interações.</w:t>
-      </w:r>
-      <w:r>
-        <w:rPr>
-          <w:rFonts w:ascii="Arial" w:hAnsi="Arial" w:cs="Arial"/>
-        </w:rPr>
-        <w:t xml:space="preserve"> Pode ser tipificado como uma gamificação.</w:t>
-      </w:r>
-    </w:p>
-    <w:p>
-      <w:pPr>
-        <w:spacing w:after="0" w:line="360" w:lineRule="auto"/>
-        <w:ind w:left="357"/>
-        <w:jc w:val="both"/>
-        <w:rPr>
-          <w:rFonts w:ascii="Arial" w:hAnsi="Arial" w:cs="Arial"/>
-        </w:rPr>
-      </w:pPr>
-    </w:p>
-    <w:p>
-      <w:pPr>
-        <w:spacing w:after="0" w:line="360" w:lineRule="auto"/>
-        <w:ind w:left="357"/>
-        <w:jc w:val="both"/>
-        <w:rPr>
-          <w:rFonts w:ascii="Arial" w:hAnsi="Arial" w:cs="Arial"/>
-        </w:rPr>
-      </w:pPr>
-    </w:p>
-    <w:p>
-      <w:pPr>
-        <w:pStyle w:val="PargrafodaLista"/>
-        <w:numPr>
-          <w:ilvl w:val="0"/>
-          <w:numId w:val="1"/>
-        </w:numPr>
-        <w:spacing w:after="0" w:line="360" w:lineRule="auto"/>
-        <w:ind w:left="357" w:hanging="357"/>
-        <w:jc w:val="both"/>
-        <w:rPr>
-          <w:rFonts w:ascii="Arial" w:hAnsi="Arial" w:cs="Arial"/>
-          <w:b/>
-          <w:bCs/>
-        </w:rPr>
-      </w:pPr>
-      <w:r>
-        <w:rPr>
-          <w:rFonts w:ascii="Arial" w:hAnsi="Arial" w:cs="Arial"/>
-          <w:b/>
-          <w:bCs/>
-        </w:rPr>
-        <w:t>REGRAS DE NEGÓCIO</w:t>
-      </w:r>
-    </w:p>
-    <w:p>
-      <w:pPr>
-        <w:pStyle w:val="PargrafodaLista"/>
-        <w:spacing w:after="0" w:line="360" w:lineRule="auto"/>
-        <w:jc w:val="both"/>
-        <w:rPr>
-          <w:rFonts w:ascii="Arial" w:hAnsi="Arial" w:cs="Arial"/>
-        </w:rPr>
-      </w:pPr>
-    </w:p>
-    <w:p>
-      <w:pPr>
-        <w:spacing w:after="120" w:line="360" w:lineRule="auto"/>
-        <w:ind w:left="357"/>
-        <w:jc w:val="both"/>
-      </w:pPr>
-      <w:r>
-        <w:rPr>
-          <w:b/>
-          <w:bCs/>
-        </w:rPr>
-        <w:t>4.1.</w:t>
-      </w:r>
-      <w:r>
-        <w:rPr>
-          <w:b/>
-          <w:bCs/>
-        </w:rPr>
-        <w:t xml:space="preserve"> </w:t>
-      </w:r>
-      <w:r>
-        <w:rPr>
-          <w:b/>
-          <w:bCs/>
-        </w:rPr>
-        <w:t>Do Avatar</w:t>
-      </w:r>
-      <w:r>
-        <w:rPr>
-          <w:b/>
-          <w:bCs/>
-        </w:rPr>
-        <w:t>:</w:t>
-      </w:r>
-      <w:r>
-        <w:t xml:space="preserve"> </w:t>
-      </w:r>
-      <w:r>
-        <w:t xml:space="preserve">Responsável por interagir com o </w:t>
-      </w:r>
-      <w:r>
-        <w:t xml:space="preserve">usuário ativo </w:t>
-      </w:r>
-      <w:r>
-        <w:t>atuando como um guia sobre a interação deste com a plataforma. Pode apresentar sugestões dependendo das interações do usuário;</w:t>
-      </w:r>
-    </w:p>
-    <w:p>
-      <w:pPr>
-        <w:spacing w:after="120" w:line="360" w:lineRule="auto"/>
-        <w:ind w:left="357"/>
-        <w:jc w:val="both"/>
-      </w:pPr>
-      <w:r>
-        <w:rPr>
-          <w:b/>
-          <w:bCs/>
-        </w:rPr>
-        <w:t>4.2.</w:t>
-      </w:r>
-      <w:r>
-        <w:rPr>
-          <w:b/>
-          <w:bCs/>
-        </w:rPr>
-        <w:t xml:space="preserve"> Atribuição de Autoria de Posts:</w:t>
-      </w:r>
-      <w:r>
-        <w:t xml:space="preserve"> Todo post registrado no sistema deve identificar obrigatoriamente o usuário autor (</w:t>
-      </w:r>
-      <w:proofErr w:type="spellStart"/>
-      <w:r>
-        <w:t>id_usuario</w:t>
-      </w:r>
-      <w:proofErr w:type="spellEnd"/>
-      <w:r>
-        <w:t xml:space="preserve"> para fins de auditoria e métricas de engajamento.</w:t>
-      </w:r>
-    </w:p>
-    <w:p>
-      <w:pPr>
-        <w:spacing w:after="120" w:line="360" w:lineRule="auto"/>
-        <w:ind w:left="357"/>
-        <w:jc w:val="both"/>
-      </w:pPr>
-      <w:r>
-        <w:rPr>
-          <w:b/>
-          <w:bCs/>
-        </w:rPr>
-        <w:t xml:space="preserve">4.3. </w:t>
-      </w:r>
-      <w:r>
-        <w:rPr>
-          <w:b/>
-          <w:bCs/>
-        </w:rPr>
-        <w:t>Autorreferência de Comentários:</w:t>
-      </w:r>
-      <w:r>
-        <w:t xml:space="preserve"> Um comentário é tratado nativamente como um post. Para ser considerado um comentário ou resposta, a entidade Post deve obrigatoriamente apontar para um </w:t>
-      </w:r>
-      <w:proofErr w:type="spellStart"/>
-      <w:r>
-        <w:t>id_post_pai</w:t>
-      </w:r>
-      <w:proofErr w:type="spellEnd"/>
-      <w:r>
-        <w:t xml:space="preserve"> existente. </w:t>
-      </w:r>
-    </w:p>
-    <w:p>
-      <w:pPr>
-        <w:spacing w:after="120" w:line="360" w:lineRule="auto"/>
-        <w:ind w:left="357"/>
-        <w:jc w:val="both"/>
-      </w:pPr>
-      <w:r>
-        <w:rPr>
-          <w:b/>
-          <w:bCs/>
-        </w:rPr>
-        <w:t xml:space="preserve">4.4. </w:t>
-      </w:r>
-      <w:r>
-        <w:rPr>
-          <w:b/>
-          <w:bCs/>
-        </w:rPr>
-        <w:t>Atribuição de Autoria de Comunidade</w:t>
-      </w:r>
-      <w:r>
-        <w:rPr>
-          <w:b/>
-          <w:bCs/>
-        </w:rPr>
-        <w:t>:</w:t>
-      </w:r>
-      <w:r>
-        <w:t xml:space="preserve"> </w:t>
-      </w:r>
-      <w:r>
-        <w:t>D</w:t>
-      </w:r>
-      <w:r>
-        <w:t>efine formalmente quem possui o direito de propriedade, moderação e controle sobre uma comunidade criada dentro da plataforma, além de estabelecer como o sistema registra essa responsabilidade no banco de dados.</w:t>
-      </w:r>
-    </w:p>
-    <w:p>
-      <w:pPr>
-        <w:spacing w:after="120" w:line="360" w:lineRule="auto"/>
-        <w:ind w:left="357"/>
-        <w:jc w:val="both"/>
-      </w:pPr>
-      <w:r>
-        <w:rPr>
-          <w:b/>
-          <w:bCs/>
-        </w:rPr>
-        <w:t>4.5.</w:t>
-      </w:r>
-      <w:r>
-        <w:rPr>
-          <w:b/>
-          <w:bCs/>
-        </w:rPr>
-        <w:t xml:space="preserve"> Unicidade de Engajamento</w:t>
-      </w:r>
-      <w:r>
-        <w:t>: Um usuário só pode registrar uma única curtida por post. O sistema deve validar a chave composta (</w:t>
-      </w:r>
-      <w:proofErr w:type="spellStart"/>
-      <w:r>
-        <w:t>id_usuario</w:t>
-      </w:r>
-      <w:proofErr w:type="spellEnd"/>
-      <w:r>
-        <w:t xml:space="preserve"> + </w:t>
-      </w:r>
-      <w:proofErr w:type="spellStart"/>
-      <w:r>
-        <w:t>id_post</w:t>
-      </w:r>
-      <w:proofErr w:type="spellEnd"/>
-      <w:r>
-        <w:t>) para impedir duplicidade de reações e garantir a integridade dos contadores de performance em tempo real.</w:t>
-      </w:r>
-    </w:p>
-    <w:p>
-      <w:pPr>
-        <w:spacing w:after="120" w:line="360" w:lineRule="auto"/>
-        <w:ind w:left="357"/>
-      </w:pPr>
-    </w:p>
-    <w:p>
-      <w:pPr>
-        <w:spacing w:after="120" w:line="360" w:lineRule="auto"/>
-        <w:ind w:left="357"/>
-      </w:pPr>
-    </w:p>
-    <w:p>
-      <w:pPr>
-        <w:spacing w:after="0"/>
-        <w:rPr>
-          <w:b/>
-          <w:bCs/>
-        </w:rPr>
-      </w:pPr>
-    </w:p>
-    <w:p>
-      <w:pPr>
-        <w:spacing w:after="0"/>
-        <w:rPr>
-          <w:b/>
-          <w:bCs/>
-        </w:rPr>
-      </w:pPr>
-    </w:p>
-    <w:p>
-      <w:pPr>
-        <w:spacing w:after="0"/>
-        <w:rPr>
-          <w:b/>
-          <w:bCs/>
-        </w:rPr>
-      </w:pPr>
-    </w:p>
-    <w:p>
-      <w:pPr>
-        <w:spacing w:after="0"/>
-        <w:rPr>
-          <w:b/>
-          <w:bCs/>
-        </w:rPr>
-      </w:pPr>
-    </w:p>
-    <w:p>
-      <w:pPr>
-        <w:spacing w:after="0"/>
-        <w:rPr>
-          <w:b/>
-          <w:bCs/>
-        </w:rPr>
-      </w:pPr>
-    </w:p>
-    <w:p>
-      <w:pPr>
-        <w:spacing w:after="0"/>
-        <w:rPr>
-          <w:b/>
-          <w:bCs/>
-        </w:rPr>
-      </w:pPr>
-    </w:p>
-    <w:p>
-      <w:pPr>
-        <w:pStyle w:val="PargrafodaLista"/>
-        <w:numPr>
-          <w:ilvl w:val="0"/>
-          <w:numId w:val="1"/>
-        </w:numPr>
-        <w:spacing w:after="0"/>
-        <w:ind w:left="357" w:hanging="357"/>
-        <w:rPr>
-          <w:b/>
-          <w:bCs/>
-        </w:rPr>
-      </w:pPr>
-      <w:r>
-        <w:rPr>
-          <w:b/>
-          <w:bCs/>
-        </w:rPr>
-        <w:lastRenderedPageBreak/>
+          <w:color w:val="auto"/>
+          <w:sz w:val="24"/>
+          <w:szCs w:val="24"/>
+        </w:rPr>
         <w:t>MODELO CONCEITUAL</w:t>
       </w:r>
-    </w:p>
-    <w:p>
-      <w:pPr>
-        <w:spacing w:after="0"/>
-        <w:rPr>
-          <w:b/>
-          <w:bCs/>
-        </w:rPr>
-      </w:pPr>
-    </w:p>
-    <w:p>
-      <w:pPr>
-        <w:spacing w:after="0"/>
-        <w:rPr>
-          <w:b/>
-          <w:bCs/>
-        </w:rPr>
-      </w:pPr>
+      <w:bookmarkEnd w:id="4"/>
     </w:p>
     <w:p>
       <w:pPr>
@@ -1348,9 +1964,9 @@
           <w:noProof/>
         </w:rPr>
         <w:drawing>
-          <wp:inline distT="0" distB="0" distL="0" distR="0" wp14:anchorId="608C1629" wp14:editId="51C8F6CF">
-            <wp:extent cx="7965707" cy="4230053"/>
-            <wp:effectExtent l="952" t="0" r="0" b="0"/>
+          <wp:inline distT="0" distB="0" distL="0" distR="0" wp14:anchorId="608C1629" wp14:editId="0D24F75E">
+            <wp:extent cx="8136207" cy="4320593"/>
+            <wp:effectExtent l="2540" t="0" r="1270" b="1270"/>
             <wp:docPr id="1024129620" name="Imagem 1"/>
             <wp:cNvGraphicFramePr>
               <a:graphicFrameLocks xmlns:a="http://schemas.openxmlformats.org/drawingml/2006/main" noChangeAspect="1"/>
@@ -1363,7 +1979,7 @@
                     <pic:cNvPicPr/>
                   </pic:nvPicPr>
                   <pic:blipFill>
-                    <a:blip r:embed="rId6">
+                    <a:blip r:embed="rId10">
                       <a:extLst>
                         <a:ext uri="{28A0092B-C50C-407E-A947-70E740481C1C}">
                           <a14:useLocalDpi xmlns:a14="http://schemas.microsoft.com/office/drawing/2010/main" val="0"/>
@@ -1377,7 +1993,7 @@
                   <pic:spPr>
                     <a:xfrm rot="5400000">
                       <a:off x="0" y="0"/>
-                      <a:ext cx="7975956" cy="4235495"/>
+                      <a:ext cx="8169514" cy="4338280"/>
                     </a:xfrm>
                     <a:prstGeom prst="rect">
                       <a:avLst/>
@@ -1392,26 +2008,41 @@
     </w:p>
     <w:p>
       <w:pPr>
-        <w:pStyle w:val="PargrafodaLista"/>
-        <w:numPr>
-          <w:ilvl w:val="0"/>
-          <w:numId w:val="1"/>
-        </w:numPr>
-        <w:spacing w:after="0"/>
-        <w:ind w:left="357" w:hanging="357"/>
-        <w:rPr>
+        <w:pStyle w:val="Ttulo1"/>
+        <w:rPr>
+          <w:rFonts w:ascii="Arial" w:hAnsi="Arial" w:cs="Arial"/>
           <w:b/>
           <w:bCs/>
-        </w:rPr>
-      </w:pPr>
-      <w:r>
-        <w:rPr>
+          <w:color w:val="auto"/>
+          <w:sz w:val="24"/>
+          <w:szCs w:val="24"/>
+        </w:rPr>
+      </w:pPr>
+      <w:bookmarkStart w:id="5" w:name="_Toc230100947"/>
+      <w:r>
+        <w:rPr>
+          <w:rFonts w:ascii="Arial" w:hAnsi="Arial" w:cs="Arial"/>
           <w:b/>
           <w:bCs/>
+          <w:color w:val="auto"/>
+          <w:sz w:val="24"/>
+          <w:szCs w:val="24"/>
         </w:rPr>
         <w:lastRenderedPageBreak/>
+        <w:t xml:space="preserve">6. </w:t>
+      </w:r>
+      <w:r>
+        <w:rPr>
+          <w:rFonts w:ascii="Arial" w:hAnsi="Arial" w:cs="Arial"/>
+          <w:b/>
+          <w:bCs/>
+          <w:color w:val="auto"/>
+          <w:sz w:val="24"/>
+          <w:szCs w:val="24"/>
+        </w:rPr>
         <w:t>MODELO RELACIONAL</w:t>
       </w:r>
+      <w:bookmarkEnd w:id="5"/>
     </w:p>
     <w:p>
       <w:pPr>
@@ -1438,10 +2069,10 @@
           <w:noProof/>
         </w:rPr>
         <w:drawing>
-          <wp:inline distT="0" distB="0" distL="0" distR="0" wp14:anchorId="3571DBD3" wp14:editId="114A4D32">
-            <wp:extent cx="8504137" cy="4330350"/>
-            <wp:effectExtent l="0" t="8573" r="2858" b="2857"/>
-            <wp:docPr id="949241360" name="Imagem 2"/>
+          <wp:inline distT="0" distB="0" distL="0" distR="0" wp14:anchorId="7B1F66A2" wp14:editId="23228A0E">
+            <wp:extent cx="8359256" cy="4402179"/>
+            <wp:effectExtent l="0" t="2540" r="1270" b="1270"/>
+            <wp:docPr id="1936684640" name="Imagem 1"/>
             <wp:cNvGraphicFramePr>
               <a:graphicFrameLocks xmlns:a="http://schemas.openxmlformats.org/drawingml/2006/main" noChangeAspect="1"/>
             </wp:cNvGraphicFramePr>
@@ -1449,17 +2080,11 @@
               <a:graphicData uri="http://schemas.openxmlformats.org/drawingml/2006/picture">
                 <pic:pic xmlns:pic="http://schemas.openxmlformats.org/drawingml/2006/picture">
                   <pic:nvPicPr>
-                    <pic:cNvPr id="949241360" name="Imagem 949241360"/>
+                    <pic:cNvPr id="1936684640" name=""/>
                     <pic:cNvPicPr/>
                   </pic:nvPicPr>
                   <pic:blipFill>
-                    <a:blip r:embed="rId7">
-                      <a:extLst>
-                        <a:ext uri="{28A0092B-C50C-407E-A947-70E740481C1C}">
-                          <a14:useLocalDpi xmlns:a14="http://schemas.microsoft.com/office/drawing/2010/main" val="0"/>
-                        </a:ext>
-                      </a:extLst>
-                    </a:blip>
+                    <a:blip r:embed="rId11"/>
                     <a:stretch>
                       <a:fillRect/>
                     </a:stretch>
@@ -1467,7 +2092,7 @@
                   <pic:spPr>
                     <a:xfrm rot="5400000">
                       <a:off x="0" y="0"/>
-                      <a:ext cx="8514526" cy="4335640"/>
+                      <a:ext cx="8387121" cy="4416853"/>
                     </a:xfrm>
                     <a:prstGeom prst="rect">
                       <a:avLst/>
@@ -1481,13 +2106,107 @@
       </w:r>
     </w:p>
     <w:sectPr>
+      <w:footerReference w:type="default" r:id="rId12"/>
       <w:pgSz w:w="11906" w:h="16838"/>
       <w:pgMar w:top="1701" w:right="1134" w:bottom="1134" w:left="1701" w:header="709" w:footer="709" w:gutter="0"/>
       <w:cols w:space="708"/>
+      <w:titlePg/>
       <w:docGrid w:linePitch="360"/>
     </w:sectPr>
   </w:body>
 </w:document>
+</file>
+
+<file path=word/endnotes.xml><?xml version="1.0" encoding="utf-8"?>
+<w:endnotes xmlns:wpc="http://schemas.microsoft.com/office/word/2010/wordprocessingCanvas" xmlns:cx="http://schemas.microsoft.com/office/drawing/2014/chartex" xmlns:cx1="http://schemas.microsoft.com/office/drawing/2015/9/8/chartex" xmlns:cx2="http://schemas.microsoft.com/office/drawing/2015/10/21/chartex" xmlns:cx3="http://schemas.microsoft.com/office/drawing/2016/5/9/chartex" xmlns:cx4="http://schemas.microsoft.com/office/drawing/2016/5/10/chartex" xmlns:cx5="http://schemas.microsoft.com/office/drawing/2016/5/11/chartex" xmlns:cx6="http://schemas.microsoft.com/office/drawing/2016/5/12/chartex" xmlns:cx7="http://schemas.microsoft.com/office/drawing/2016/5/13/chartex" xmlns:cx8="http://schemas.microsoft.com/office/drawing/2016/5/14/chartex" xmlns:mc="http://schemas.openxmlformats.org/markup-compatibility/2006" xmlns:aink="http://schemas.microsoft.com/office/drawing/2016/ink" xmlns:am3d="http://schemas.microsoft.com/office/drawing/2017/model3d" xmlns:o="urn:schemas-microsoft-com:office:office" xmlns:oel="http://schemas.microsoft.com/office/2019/extlst" xmlns:r="http://schemas.openxmlformats.org/officeDocument/2006/relationships" xmlns:m="http://schemas.openxmlformats.org/officeDocument/2006/math" xmlns:v="urn:schemas-microsoft-com:vml" xmlns:wp14="http://schemas.microsoft.com/office/word/2010/wordprocessingDrawing" xmlns:wp="http://schemas.openxmlformats.org/drawingml/2006/wordprocessingDrawing" xmlns:w10="urn:schemas-microsoft-com:office:word" xmlns:w="http://schemas.openxmlformats.org/wordprocessingml/2006/main" xmlns:w14="http://schemas.microsoft.com/office/word/2010/wordml" xmlns:w15="http://schemas.microsoft.com/office/word/2012/wordml" xmlns:w16cex="http://schemas.microsoft.com/office/word/2018/wordml/cex" xmlns:w16cid="http://schemas.microsoft.com/office/word/2016/wordml/cid" xmlns:w16="http://schemas.microsoft.com/office/word/2018/wordml" xmlns:w16du="http://schemas.microsoft.com/office/word/2023/wordml/word16du" xmlns:w16sdtdh="http://schemas.microsoft.com/office/word/2020/wordml/sdtdatahash" xmlns:w16sdtfl="http://schemas.microsoft.com/office/word/2024/wordml/sdtformatlock" xmlns:w16se="http://schemas.microsoft.com/office/word/2015/wordml/symex" xmlns:wpg="http://schemas.microsoft.com/office/word/2010/wordprocessingGroup" xmlns:wpi="http://schemas.microsoft.com/office/word/2010/wordprocessingInk" xmlns:wne="http://schemas.microsoft.com/office/word/2006/wordml" xmlns:wps="http://schemas.microsoft.com/office/word/2010/wordprocessingShape" mc:Ignorable="w14 w15 w16se w16cid w16 w16cex w16sdtdh w16sdtfl w16du wp14">
+  <w:endnote w:type="separator" w:id="-1">
+    <w:p>
+      <w:pPr>
+        <w:spacing w:after="0" w:line="240" w:lineRule="auto"/>
+      </w:pPr>
+      <w:r>
+        <w:separator/>
+      </w:r>
+    </w:p>
+  </w:endnote>
+  <w:endnote w:type="continuationSeparator" w:id="0">
+    <w:p>
+      <w:pPr>
+        <w:spacing w:after="0" w:line="240" w:lineRule="auto"/>
+      </w:pPr>
+      <w:r>
+        <w:continuationSeparator/>
+      </w:r>
+    </w:p>
+  </w:endnote>
+</w:endnotes>
+</file>
+
+<file path=word/footer1.xml><?xml version="1.0" encoding="utf-8"?>
+<w:ftr xmlns:wpc="http://schemas.microsoft.com/office/word/2010/wordprocessingCanvas" xmlns:cx="http://schemas.microsoft.com/office/drawing/2014/chartex" xmlns:cx1="http://schemas.microsoft.com/office/drawing/2015/9/8/chartex" xmlns:cx2="http://schemas.microsoft.com/office/drawing/2015/10/21/chartex" xmlns:cx3="http://schemas.microsoft.com/office/drawing/2016/5/9/chartex" xmlns:cx4="http://schemas.microsoft.com/office/drawing/2016/5/10/chartex" xmlns:cx5="http://schemas.microsoft.com/office/drawing/2016/5/11/chartex" xmlns:cx6="http://schemas.microsoft.com/office/drawing/2016/5/12/chartex" xmlns:cx7="http://schemas.microsoft.com/office/drawing/2016/5/13/chartex" xmlns:cx8="http://schemas.microsoft.com/office/drawing/2016/5/14/chartex" xmlns:mc="http://schemas.openxmlformats.org/markup-compatibility/2006" xmlns:aink="http://schemas.microsoft.com/office/drawing/2016/ink" xmlns:am3d="http://schemas.microsoft.com/office/drawing/2017/model3d" xmlns:o="urn:schemas-microsoft-com:office:office" xmlns:oel="http://schemas.microsoft.com/office/2019/extlst" xmlns:r="http://schemas.openxmlformats.org/officeDocument/2006/relationships" xmlns:m="http://schemas.openxmlformats.org/officeDocument/2006/math" xmlns:v="urn:schemas-microsoft-com:vml" xmlns:wp14="http://schemas.microsoft.com/office/word/2010/wordprocessingDrawing" xmlns:wp="http://schemas.openxmlformats.org/drawingml/2006/wordprocessingDrawing" xmlns:w10="urn:schemas-microsoft-com:office:word" xmlns:w="http://schemas.openxmlformats.org/wordprocessingml/2006/main" xmlns:w14="http://schemas.microsoft.com/office/word/2010/wordml" xmlns:w15="http://schemas.microsoft.com/office/word/2012/wordml" xmlns:w16cex="http://schemas.microsoft.com/office/word/2018/wordml/cex" xmlns:w16cid="http://schemas.microsoft.com/office/word/2016/wordml/cid" xmlns:w16="http://schemas.microsoft.com/office/word/2018/wordml" xmlns:w16du="http://schemas.microsoft.com/office/word/2023/wordml/word16du" xmlns:w16sdtdh="http://schemas.microsoft.com/office/word/2020/wordml/sdtdatahash" xmlns:w16sdtfl="http://schemas.microsoft.com/office/word/2024/wordml/sdtformatlock" xmlns:w16se="http://schemas.microsoft.com/office/word/2015/wordml/symex" xmlns:wpg="http://schemas.microsoft.com/office/word/2010/wordprocessingGroup" xmlns:wpi="http://schemas.microsoft.com/office/word/2010/wordprocessingInk" xmlns:wne="http://schemas.microsoft.com/office/word/2006/wordml" xmlns:wps="http://schemas.microsoft.com/office/word/2010/wordprocessingShape" mc:Ignorable="w14 w15 w16se w16cid w16 w16cex w16sdtdh w16sdtfl w16du wp14">
+  <w:sdt>
+    <w:sdtPr>
+      <w:id w:val="344681196"/>
+      <w:docPartObj>
+        <w:docPartGallery w:val="Page Numbers (Bottom of Page)"/>
+        <w:docPartUnique/>
+      </w:docPartObj>
+    </w:sdtPr>
+    <w:sdtContent>
+      <w:p>
+        <w:pPr>
+          <w:pStyle w:val="Rodap"/>
+          <w:jc w:val="right"/>
+        </w:pPr>
+        <w:r>
+          <w:fldChar w:fldCharType="begin"/>
+        </w:r>
+        <w:r>
+          <w:instrText>PAGE   \* MERGEFORMAT</w:instrText>
+        </w:r>
+        <w:r>
+          <w:fldChar w:fldCharType="separate"/>
+        </w:r>
+        <w:r>
+          <w:t>2</w:t>
+        </w:r>
+        <w:r>
+          <w:fldChar w:fldCharType="end"/>
+        </w:r>
+      </w:p>
+    </w:sdtContent>
+  </w:sdt>
+  <w:p>
+    <w:pPr>
+      <w:pStyle w:val="Rodap"/>
+    </w:pPr>
+  </w:p>
+</w:ftr>
+</file>
+
+<file path=word/footnotes.xml><?xml version="1.0" encoding="utf-8"?>
+<w:footnotes xmlns:wpc="http://schemas.microsoft.com/office/word/2010/wordprocessingCanvas" xmlns:cx="http://schemas.microsoft.com/office/drawing/2014/chartex" xmlns:cx1="http://schemas.microsoft.com/office/drawing/2015/9/8/chartex" xmlns:cx2="http://schemas.microsoft.com/office/drawing/2015/10/21/chartex" xmlns:cx3="http://schemas.microsoft.com/office/drawing/2016/5/9/chartex" xmlns:cx4="http://schemas.microsoft.com/office/drawing/2016/5/10/chartex" xmlns:cx5="http://schemas.microsoft.com/office/drawing/2016/5/11/chartex" xmlns:cx6="http://schemas.microsoft.com/office/drawing/2016/5/12/chartex" xmlns:cx7="http://schemas.microsoft.com/office/drawing/2016/5/13/chartex" xmlns:cx8="http://schemas.microsoft.com/office/drawing/2016/5/14/chartex" xmlns:mc="http://schemas.openxmlformats.org/markup-compatibility/2006" xmlns:aink="http://schemas.microsoft.com/office/drawing/2016/ink" xmlns:am3d="http://schemas.microsoft.com/office/drawing/2017/model3d" xmlns:o="urn:schemas-microsoft-com:office:office" xmlns:oel="http://schemas.microsoft.com/office/2019/extlst" xmlns:r="http://schemas.openxmlformats.org/officeDocument/2006/relationships" xmlns:m="http://schemas.openxmlformats.org/officeDocument/2006/math" xmlns:v="urn:schemas-microsoft-com:vml" xmlns:wp14="http://schemas.microsoft.com/office/word/2010/wordprocessingDrawing" xmlns:wp="http://schemas.openxmlformats.org/drawingml/2006/wordprocessingDrawing" xmlns:w10="urn:schemas-microsoft-com:office:word" xmlns:w="http://schemas.openxmlformats.org/wordprocessingml/2006/main" xmlns:w14="http://schemas.microsoft.com/office/word/2010/wordml" xmlns:w15="http://schemas.microsoft.com/office/word/2012/wordml" xmlns:w16cex="http://schemas.microsoft.com/office/word/2018/wordml/cex" xmlns:w16cid="http://schemas.microsoft.com/office/word/2016/wordml/cid" xmlns:w16="http://schemas.microsoft.com/office/word/2018/wordml" xmlns:w16du="http://schemas.microsoft.com/office/word/2023/wordml/word16du" xmlns:w16sdtdh="http://schemas.microsoft.com/office/word/2020/wordml/sdtdatahash" xmlns:w16sdtfl="http://schemas.microsoft.com/office/word/2024/wordml/sdtformatlock" xmlns:w16se="http://schemas.microsoft.com/office/word/2015/wordml/symex" xmlns:wpg="http://schemas.microsoft.com/office/word/2010/wordprocessingGroup" xmlns:wpi="http://schemas.microsoft.com/office/word/2010/wordprocessingInk" xmlns:wne="http://schemas.microsoft.com/office/word/2006/wordml" xmlns:wps="http://schemas.microsoft.com/office/word/2010/wordprocessingShape" mc:Ignorable="w14 w15 w16se w16cid w16 w16cex w16sdtdh w16sdtfl w16du wp14">
+  <w:footnote w:type="separator" w:id="-1">
+    <w:p>
+      <w:pPr>
+        <w:spacing w:after="0" w:line="240" w:lineRule="auto"/>
+      </w:pPr>
+      <w:r>
+        <w:separator/>
+      </w:r>
+    </w:p>
+  </w:footnote>
+  <w:footnote w:type="continuationSeparator" w:id="0">
+    <w:p>
+      <w:pPr>
+        <w:spacing w:after="0" w:line="240" w:lineRule="auto"/>
+      </w:pPr>
+      <w:r>
+        <w:continuationSeparator/>
+      </w:r>
+    </w:p>
+  </w:footnote>
+</w:footnotes>
 </file>
 
 <file path=word/numbering.xml><?xml version="1.0" encoding="utf-8"?>
@@ -1495,10 +2214,11 @@
   <w:abstractNum w:abstractNumId="0" w15:restartNumberingAfterBreak="0">
     <w:nsid w:val="10A242E2"/>
     <w:multiLevelType w:val="hybridMultilevel"/>
-    <w:tmpl w:val="42A4DF80"/>
-    <w:lvl w:ilvl="0" w:tplc="0416000F">
+    <w:tmpl w:val="D4FEC97C"/>
+    <w:lvl w:ilvl="0" w:tplc="4F9C7DB0">
       <w:start w:val="1"/>
       <w:numFmt w:val="decimal"/>
+      <w:pStyle w:val="Estilo1"/>
       <w:lvlText w:val="%1."/>
       <w:lvlJc w:val="left"/>
       <w:pPr>
@@ -2191,7 +2911,6 @@
   <w:style w:type="character" w:default="1" w:styleId="Fontepargpadro">
     <w:name w:val="Default Paragraph Font"/>
     <w:uiPriority w:val="1"/>
-    <w:semiHidden/>
     <w:unhideWhenUsed/>
   </w:style>
   <w:style w:type="table" w:default="1" w:styleId="Tabelanormal">
@@ -2436,6 +3155,7 @@
   <w:style w:type="paragraph" w:styleId="PargrafodaLista">
     <w:name w:val="List Paragraph"/>
     <w:basedOn w:val="Normal"/>
+    <w:link w:val="PargrafodaListaChar"/>
     <w:uiPriority w:val="34"/>
     <w:qFormat/>
     <w:rsid w:val="005F7130"/>
@@ -2503,6 +3223,158 @@
       <w:smallCaps/>
       <w:color w:val="0F4761" w:themeColor="accent1" w:themeShade="BF"/>
       <w:spacing w:val="5"/>
+    </w:rPr>
+  </w:style>
+  <w:style w:type="paragraph" w:styleId="CabealhodoSumrio">
+    <w:name w:val="TOC Heading"/>
+    <w:basedOn w:val="Ttulo1"/>
+    <w:next w:val="Normal"/>
+    <w:uiPriority w:val="39"/>
+    <w:unhideWhenUsed/>
+    <w:qFormat/>
+    <w:rsid w:val="006E4BBB"/>
+    <w:pPr>
+      <w:spacing w:before="240" w:after="0"/>
+      <w:outlineLvl w:val="9"/>
+    </w:pPr>
+    <w:rPr>
+      <w:kern w:val="0"/>
+      <w:sz w:val="32"/>
+      <w:szCs w:val="32"/>
+      <w:lang w:eastAsia="pt-BR"/>
+      <w14:ligatures w14:val="none"/>
+    </w:rPr>
+  </w:style>
+  <w:style w:type="paragraph" w:customStyle="1" w:styleId="Estilo1">
+    <w:name w:val="Estilo1"/>
+    <w:basedOn w:val="PargrafodaLista"/>
+    <w:link w:val="Estilo1Char"/>
+    <w:qFormat/>
+    <w:rsid w:val="006E4BBB"/>
+    <w:pPr>
+      <w:numPr>
+        <w:numId w:val="1"/>
+      </w:numPr>
+      <w:spacing w:after="0"/>
+      <w:ind w:left="357" w:hanging="357"/>
+    </w:pPr>
+    <w:rPr>
+      <w:rFonts w:ascii="Arial" w:hAnsi="Arial" w:cs="Arial"/>
+      <w:b/>
+      <w:bCs/>
+    </w:rPr>
+  </w:style>
+  <w:style w:type="character" w:customStyle="1" w:styleId="PargrafodaListaChar">
+    <w:name w:val="Parágrafo da Lista Char"/>
+    <w:basedOn w:val="Fontepargpadro"/>
+    <w:link w:val="PargrafodaLista"/>
+    <w:uiPriority w:val="34"/>
+    <w:rsid w:val="006E4BBB"/>
+  </w:style>
+  <w:style w:type="character" w:customStyle="1" w:styleId="Estilo1Char">
+    <w:name w:val="Estilo1 Char"/>
+    <w:basedOn w:val="PargrafodaListaChar"/>
+    <w:link w:val="Estilo1"/>
+    <w:rsid w:val="006E4BBB"/>
+    <w:rPr>
+      <w:rFonts w:ascii="Arial" w:hAnsi="Arial" w:cs="Arial"/>
+      <w:b/>
+      <w:bCs/>
+    </w:rPr>
+  </w:style>
+  <w:style w:type="paragraph" w:styleId="Cabealho">
+    <w:name w:val="header"/>
+    <w:basedOn w:val="Normal"/>
+    <w:link w:val="CabealhoChar"/>
+    <w:uiPriority w:val="99"/>
+    <w:unhideWhenUsed/>
+    <w:rsid w:val="006E4BBB"/>
+    <w:pPr>
+      <w:tabs>
+        <w:tab w:val="center" w:pos="4252"/>
+        <w:tab w:val="right" w:pos="8504"/>
+      </w:tabs>
+      <w:spacing w:after="0" w:line="240" w:lineRule="auto"/>
+    </w:pPr>
+  </w:style>
+  <w:style w:type="character" w:customStyle="1" w:styleId="CabealhoChar">
+    <w:name w:val="Cabeçalho Char"/>
+    <w:basedOn w:val="Fontepargpadro"/>
+    <w:link w:val="Cabealho"/>
+    <w:uiPriority w:val="99"/>
+    <w:rsid w:val="006E4BBB"/>
+  </w:style>
+  <w:style w:type="paragraph" w:styleId="Rodap">
+    <w:name w:val="footer"/>
+    <w:basedOn w:val="Normal"/>
+    <w:link w:val="RodapChar"/>
+    <w:uiPriority w:val="99"/>
+    <w:unhideWhenUsed/>
+    <w:rsid w:val="006E4BBB"/>
+    <w:pPr>
+      <w:tabs>
+        <w:tab w:val="center" w:pos="4252"/>
+        <w:tab w:val="right" w:pos="8504"/>
+      </w:tabs>
+      <w:spacing w:after="0" w:line="240" w:lineRule="auto"/>
+    </w:pPr>
+  </w:style>
+  <w:style w:type="character" w:customStyle="1" w:styleId="RodapChar">
+    <w:name w:val="Rodapé Char"/>
+    <w:basedOn w:val="Fontepargpadro"/>
+    <w:link w:val="Rodap"/>
+    <w:uiPriority w:val="99"/>
+    <w:rsid w:val="006E4BBB"/>
+  </w:style>
+  <w:style w:type="paragraph" w:customStyle="1" w:styleId="Estilo2">
+    <w:name w:val="Estilo2"/>
+    <w:basedOn w:val="PargrafodaLista"/>
+    <w:link w:val="Estilo2Char"/>
+    <w:qFormat/>
+    <w:rsid w:val="006E4BBB"/>
+    <w:pPr>
+      <w:spacing w:after="120" w:line="360" w:lineRule="auto"/>
+      <w:ind w:left="357"/>
+      <w:jc w:val="both"/>
+    </w:pPr>
+    <w:rPr>
+      <w:rFonts w:ascii="Arial" w:hAnsi="Arial" w:cs="Arial"/>
+      <w:b/>
+      <w:bCs/>
+    </w:rPr>
+  </w:style>
+  <w:style w:type="character" w:customStyle="1" w:styleId="Estilo2Char">
+    <w:name w:val="Estilo2 Char"/>
+    <w:basedOn w:val="PargrafodaListaChar"/>
+    <w:link w:val="Estilo2"/>
+    <w:rsid w:val="006E4BBB"/>
+    <w:rPr>
+      <w:rFonts w:ascii="Arial" w:hAnsi="Arial" w:cs="Arial"/>
+      <w:b/>
+      <w:bCs/>
+    </w:rPr>
+  </w:style>
+  <w:style w:type="paragraph" w:styleId="Sumrio1">
+    <w:name w:val="toc 1"/>
+    <w:basedOn w:val="Normal"/>
+    <w:next w:val="Normal"/>
+    <w:autoRedefine/>
+    <w:uiPriority w:val="39"/>
+    <w:unhideWhenUsed/>
+    <w:rsid w:val="006E4BBB"/>
+    <w:pPr>
+      <w:spacing w:after="100"/>
+    </w:pPr>
+  </w:style>
+  <w:style w:type="character" w:styleId="Hyperlink">
+    <w:name w:val="Hyperlink"/>
+    <w:basedOn w:val="Fontepargpadro"/>
+    <w:uiPriority w:val="99"/>
+    <w:unhideWhenUsed/>
+    <w:rsid w:val="006E4BBB"/>
+    <w:rPr>
+      <w:color w:val="467886" w:themeColor="hyperlink"/>
+      <w:u w:val="single"/>
     </w:rPr>
   </w:style>
 </w:styles>
@@ -2801,4 +3673,16 @@
     </a:ext>
   </a:extLst>
 </a:theme>
+</file>
+
+<file path=customXml/item1.xml><?xml version="1.0" encoding="utf-8"?>
+<b:Sources xmlns:b="http://schemas.openxmlformats.org/officeDocument/2006/bibliography" xmlns="http://schemas.openxmlformats.org/officeDocument/2006/bibliography" SelectedStyle="\APASixthEditionOfficeOnline.xsl" StyleName="APA" Version="6"/>
+</file>
+
+<file path=customXml/itemProps1.xml><?xml version="1.0" encoding="utf-8"?>
+<ds:datastoreItem xmlns:ds="http://schemas.openxmlformats.org/officeDocument/2006/customXml" ds:itemID="{FB81E142-558B-4E0E-8052-950EF6D125C7}">
+  <ds:schemaRefs>
+    <ds:schemaRef ds:uri="http://schemas.openxmlformats.org/officeDocument/2006/bibliography"/>
+  </ds:schemaRefs>
+</ds:datastoreItem>
 </file>
</xml_diff>